<commit_message>
OSHAL application store — snapshot of trunk a64a2fd9 (2026-10-22)
</commit_message>
<xml_diff>
--- a/intelligent-operations/docs/event-to-action/operations-decisions.docx
+++ b/intelligent-operations/docs/event-to-action/operations-decisions.docx
@@ -1059,46 +1059,34 @@
     </w:p>
     <w:p>
       <w:pPr>
-        <w:pStyle w:val="Title"/>
+        <w:pStyle w:val="ListBullet"/>
       </w:pPr>
       <w:r>
-        <w:t>ADR 0001: Operations is an OSHAL experience slice</w:t>
-      </w:r>
-    </w:p>
-    <w:p>
-      <w:pPr/>
-      <w:r>
-        <w:t>Status: Accepted design, 20 October 2026. Implementation and installed acceptance remain tracked separately.</w:t>
-      </w:r>
-    </w:p>
-    <w:p>
-      <w:pPr/>
-      <w:r>
-        <w:t>Context: The application should feel complete and focused while reusing OSHAL login, granular grants, connections, tickets, tools, approvals and audit. A separate authentication or connection framework would fragment user authority and duplicate shared behavior.</w:t>
-      </w:r>
-    </w:p>
-    <w:p>
-      <w:pPr/>
-      <w:r>
-        <w:t>Decision: Evolve the existing intelligent-operations package into an independently navigable OSHAL experience slice. Preserve its specialist identities and canonical ticket workflow. Render Operations views of shared records and current-caller connections; do not create an alternate login, secret store, privileged connector runtime or ticket engine. Shell/navigation ownership does not change authority.</w:t>
-      </w:r>
-    </w:p>
-    <w:p>
-      <w:pPr/>
-      <w:r>
-        <w:t>Alternatives rejected: a new product identity/login; a second app duplicating the existing incident bots; application routes that bypass shared connector write confirmation or tool authority.</w:t>
-      </w:r>
-    </w:p>
-    <w:p>
-      <w:pPr/>
-      <w:r>
-        <w:t>Consequences: Native experience/current-caller APIs must be verified. Shared gaps belong at their owner boundary. The app owns sources/mappings, operational inventory, decisions, evidence and the domain UX. No manifest permission or connector allow-list is expanded just because a prototype displays a provider.</w:t>
-      </w:r>
-    </w:p>
-    <w:p>
-      <w:pPr/>
-      <w:r>
-        <w:t>Acceptance: Signed-out access refuses; the signed-in caller sees only admitted records/connections; another user cannot inherit the first user's grants; revocation clears access; existing bot/ticket IDs stay intact. A browser role selector is never accepted as server authorization.</w:t>
+        <w:t>[ADR0037: Approved response and verified recovery](adr/0037-approved-response-and-verified-recovery.md) — byte-exact generated files, approval bound to digests/target/revision with expiry, one reserved dispatch per approval through the person's own confirmed pod exec, measured recovery outcomes and a server-read ticket update.</w:t>
+      </w:r>
+    </w:p>
+    <w:p>
+      <w:pPr>
+        <w:pStyle w:val="ListBullet"/>
+      </w:pPr>
+      <w:r>
+        <w:t>[ADR0038: Local anomaly service, automatic correlation and tick notifications](adr/0038-local-anomaly-service-and-tick-automation.md) — two deterministic detectors with explicit readiness and durable cursors, candidates through the normal intake, opt-in automatic correlation on the tick, notification requests; NAB pilot measured, not tuned.</w:t>
+      </w:r>
+    </w:p>
+    <w:p>
+      <w:pPr>
+        <w:pStyle w:val="ListBullet"/>
+      </w:pPr>
+      <w:r>
+        <w:t>[ADR0039: Node-level explorer and coached commands](adr/0039-node-explorer-and-coached-commands.md) — node capacity, pressure, versions, taints and placed pods in Systems; coached kubectl/cloud/in-pod commands reviewed and run under the operator's own authority, results recorded with provenance. [KERNEL-RAILS-NEEDED.md](KERNEL-RAILS-NEEDED.md) lists what the kernel must add for in-application cloud execution, git promotion and swarm-to-swarm.</w:t>
+      </w:r>
+    </w:p>
+    <w:p>
+      <w:pPr>
+        <w:pStyle w:val="ListBullet"/>
+      </w:pPr>
+      <w:r>
+        <w:t>[ADR0040: Git promotion and break-glass reconciliation](adr/0040-git-promotion-and-break-glass-reconciliation.md) — the plan's exact files and a manifest go to a new branch with a pull/merge request and optional pipeline; an emergency execution must be reconciled in Git within 24 hours; one reservation per plan, path and destination; provider writes through the person's own confirmed connection (kernel catalog 0f86a3c).</w:t>
       </w:r>
     </w:p>
     <w:p>
@@ -1106,49 +1094,43 @@
         <w:pStyle w:val="Title"/>
       </w:pPr>
       <w:r>
-        <w:t>ADR 0002: Every event decision is inspectable</w:t>
-      </w:r>
-    </w:p>
-    <w:p>
-      <w:pPr/>
-      <w:r>
-        <w:t>Status: Accepted design, 20 October 2026. Production reduction and storage remain planned.</w:t>
-      </w:r>
-    </w:p>
-    <w:p>
-      <w:pPr/>
-      <w:r>
-        <w:t>Context: Operators need to see why incoming data was filtered, quarantined, grouped or dispatched. Alert deliveries and telemetry are different records, and repeated deliveries differ from independent occurrences. An opaque incident total cannot demonstrate the established noise-reduction behavior.</w:t>
-      </w:r>
-    </w:p>
-    <w:p>
-      <w:pPr/>
-      <w:r>
-        <w:t>Decision: Keep immutable raw-delivery provenance, separate OTLP observations, normalized alerts and versioned processing decisions. The data view traces source, mapping/rule versions, scoped identity, filter reason, delivery retry, symptom tuple, suppression/reservation, correlation membership and conditional snapshot outcome. Replays link old and new interpretations without overwriting history.</w:t>
-      </w:r>
-    </w:p>
-    <w:p>
-      <w:pPr/>
-      <w:r>
-        <w:t>Preserve the established production algorithm: stable scoped keys, suppression windows, reserve-before-dispatch, release-on-failure and bounded correlation. Inspect the existing implementation before integrating it. The prototype's simple severity/tuple demonstration is not that implementation. Stored-query percolation and telemetry window evaluation remain separate backend capabilities.</w:t>
-      </w:r>
-    </w:p>
-    <w:p>
-      <w:pPr/>
-      <w:r>
-        <w:t>Alternatives rejected: deduplication by title/hostname/message; treating every measurement as an alert; filtering after costly investigation; conflating cross-source correlation with delivery deduplication; claiming a local fixture demonstrates durable or concurrent correctness.</w:t>
-      </w:r>
-    </w:p>
-    <w:p>
-      <w:pPr/>
-      <w:r>
-        <w:t>Consequences: Decisions need durable scope, input references, versions, outcome/reason, incident link, counts, time and replay lineage. Missing identities stay quarantined; unauthorized content is withheld. A conflicting payload reusing a delivery ID must not be silently accepted as a retry.</w:t>
-      </w:r>
-    </w:p>
-    <w:p>
-      <w:pPr/>
-      <w:r>
-        <w:t>Acceptance: Explain duplicate ID versus repeated occurrence; preserve distinct source/type/resource keys; test 100 occurrences, concurrent reservation, crash/restart and release-on-failure; prove no costly analysis before reduction; inspect unmatched/quarantined records and separate OTLP signals.</w:t>
+        <w:t>ADR 0001: Operations is an OSHAL experience slice</w:t>
+      </w:r>
+    </w:p>
+    <w:p>
+      <w:pPr/>
+      <w:r>
+        <w:t>Status: Accepted design, 20 October 2026. Implementation and installed acceptance remain tracked separately.</w:t>
+      </w:r>
+    </w:p>
+    <w:p>
+      <w:pPr/>
+      <w:r>
+        <w:t>Context: The application should feel complete and focused while reusing OSHAL login, granular grants, connections, tickets, tools, approvals and audit. A separate authentication or connection framework would fragment user authority and duplicate shared behavior.</w:t>
+      </w:r>
+    </w:p>
+    <w:p>
+      <w:pPr/>
+      <w:r>
+        <w:t>Decision: Evolve the existing intelligent-operations package into an independently navigable OSHAL experience slice. Preserve its specialist identities and canonical ticket workflow. Render Operations views of shared records and current-caller connections; do not create an alternate login, secret store, privileged connector runtime or ticket engine. Shell/navigation ownership does not change authority.</w:t>
+      </w:r>
+    </w:p>
+    <w:p>
+      <w:pPr/>
+      <w:r>
+        <w:t>Alternatives rejected: a new product identity/login; a second app duplicating the existing incident bots; application routes that bypass shared connector write confirmation or tool authority.</w:t>
+      </w:r>
+    </w:p>
+    <w:p>
+      <w:pPr/>
+      <w:r>
+        <w:t>Consequences: Native experience/current-caller APIs must be verified. Shared gaps belong at their owner boundary. The app owns sources/mappings, operational inventory, decisions, evidence and the domain UX. No manifest permission or connector allow-list is expanded just because a prototype displays a provider.</w:t>
+      </w:r>
+    </w:p>
+    <w:p>
+      <w:pPr/>
+      <w:r>
+        <w:t>Acceptance: Signed-out access refuses; the signed-in caller sees only admitted records/connections; another user cannot inherit the first user's grants; revocation clears access; existing bot/ticket IDs stay intact. A browser role selector is never accepted as server authorization.</w:t>
       </w:r>
     </w:p>
     <w:p>
@@ -1156,55 +1138,49 @@
         <w:pStyle w:val="Title"/>
       </w:pPr>
       <w:r>
-        <w:t>ADR 0003: External ticket synchronization uses standard connectors</w:t>
-      </w:r>
-    </w:p>
-    <w:p>
-      <w:pPr/>
-      <w:r>
-        <w:t>Status: Accepted design,20 October2026. ADR0025 implements a manual outbound handoff in source; unattended bidirectional synchronization remains open.</w:t>
-      </w:r>
-    </w:p>
-    <w:p>
-      <w:pPr/>
-      <w:r>
-        <w:t>Context: Inbound monitoring integrations and outbound ITSM/developer-ticket integrations serve different purposes. Teams need linked ServiceNow incidents, GitHub/GitLab issues and Jira issues while retaining one canonical OSHAL ticket. All use the signed-in user's standard connection authority.</w:t>
-      </w:r>
-    </w:p>
-    <w:p>
-      <w:pPr/>
-      <w:r>
-        <w:t>Decision: Configure inbound alert sources separately from outbound and optional bidirectional ticket sync. Reuse the standard connector catalog, per-user/named-account selection, shared-connection grants, secret references, confirmed write boundary, webhook verification and audit. Implement missing operations in that framework rather than direct app HTTP clients or a second credential system.</w:t>
-      </w:r>
-    </w:p>
-    <w:p>
-      <w:pPr/>
-      <w:r>
-        <w:t>A durable link identifies tenant/principal scope, canonical ticket, provider, connection/account, external record and revisions. Policy owns field direction, status mapping, comment handling and conflict resolution. Track origin markers and revisions to suppress echoes. A durable operation ledger reserves stable operation identity before writes. Reconcile unknown creates before retrying; if a provider cannot prove the outcome, retain a blocked/manual-review state rather than claiming exactly once. Remote ticket closure is not verified infrastructure recovery. Permission loss pauses synchronization.</w:t>
-      </w:r>
-    </w:p>
-    <w:p>
-      <w:pPr/>
-      <w:r>
-        <w:t>Source review: oshal-kernel/connectors contains all four declarations. ServiceNow currently declares GET resources only; GitHub declares confirmed create/comment actions and issue webhooks; GitLab/Jira resource declarations do not establish complete guarded bidirectional status sync. The actual native write signature takes a confirmed context in crates/connectors/src/actions.rs. Provider completeness, webhook verification and installed admission must be tested per operation, not inferred from ADR prose.</w:t>
-      </w:r>
-    </w:p>
-    <w:p>
-      <w:pPr/>
-      <w:r>
-        <w:t>Alternatives rejected: app-owned credentials, blind POST retries, duplicate local ticket engines, last-write-wins status overwrite, feedback loops and automatic incident recovery from remote closure.</w:t>
-      </w:r>
-    </w:p>
-    <w:p>
-      <w:pPr/>
-      <w:r>
-        <w:t>Acceptance: One canonical link, correct caller/account and target, denied write, expired/revoked connection, lost response after create, duplicate/reordered webhook, conflict, status mapping, echo suppression and comment redaction. Use disposable provider targets; never create real tickets as part of mockup review or local repository tests.</w:t>
-      </w:r>
-    </w:p>
-    <w:p>
-      <w:pPr/>
-      <w:r>
-        <w:t>The first manual implementation is documented in [ADR0025](0025-manual-workflow-ticket-handoff.md). It reserves a current canonical snapshot before confirmed native Actions and labels durable outcomes as operator reports. It does not complete the broader synchronization acceptance above.</w:t>
+        <w:t>ADR 0002: Every event decision is inspectable</w:t>
+      </w:r>
+    </w:p>
+    <w:p>
+      <w:pPr/>
+      <w:r>
+        <w:t>Status: Accepted design, 20 October 2026. Production reduction and storage remain planned.</w:t>
+      </w:r>
+    </w:p>
+    <w:p>
+      <w:pPr/>
+      <w:r>
+        <w:t>Context: Operators need to see why incoming data was filtered, quarantined, grouped or dispatched. Alert deliveries and telemetry are different records, and repeated deliveries differ from independent occurrences. An opaque incident total cannot demonstrate the established noise-reduction behavior.</w:t>
+      </w:r>
+    </w:p>
+    <w:p>
+      <w:pPr/>
+      <w:r>
+        <w:t>Decision: Keep immutable raw-delivery provenance, separate OTLP observations, normalized alerts and versioned processing decisions. The data view traces source, mapping/rule versions, scoped identity, filter reason, delivery retry, symptom tuple, suppression/reservation, correlation membership and conditional snapshot outcome. Replays link old and new interpretations without overwriting history.</w:t>
+      </w:r>
+    </w:p>
+    <w:p>
+      <w:pPr/>
+      <w:r>
+        <w:t>Preserve the established production algorithm: stable scoped keys, suppression windows, reserve-before-dispatch, release-on-failure and bounded correlation. Inspect the existing implementation before integrating it. The prototype's simple severity/tuple demonstration is not that implementation. Stored-query percolation and telemetry window evaluation remain separate backend capabilities.</w:t>
+      </w:r>
+    </w:p>
+    <w:p>
+      <w:pPr/>
+      <w:r>
+        <w:t>Alternatives rejected: deduplication by title/hostname/message; treating every measurement as an alert; filtering after costly investigation; conflating cross-source correlation with delivery deduplication; claiming a local fixture demonstrates durable or concurrent correctness.</w:t>
+      </w:r>
+    </w:p>
+    <w:p>
+      <w:pPr/>
+      <w:r>
+        <w:t>Consequences: Decisions need durable scope, input references, versions, outcome/reason, incident link, counts, time and replay lineage. Missing identities stay quarantined; unauthorized content is withheld. A conflicting payload reusing a delivery ID must not be silently accepted as a retry.</w:t>
+      </w:r>
+    </w:p>
+    <w:p>
+      <w:pPr/>
+      <w:r>
+        <w:t>Acceptance: Explain duplicate ID versus repeated occurrence; preserve distinct source/type/resource keys; test 100 occurrences, concurrent reservation, crash/restart and release-on-failure; prove no costly analysis before reduction; inspect unmatched/quarantined records and separate OTLP signals.</w:t>
       </w:r>
     </w:p>
     <w:p>
@@ -1212,49 +1188,55 @@
         <w:pStyle w:val="Title"/>
       </w:pPr>
       <w:r>
-        <w:t>ADR 0004: CLI and background work retain user-bound OSHAL authority</w:t>
-      </w:r>
-    </w:p>
-    <w:p>
-      <w:pPr/>
-      <w:r>
-        <w:t>Status: Accepted design, 20 October 2026. Provider/runner acceptance remains required.</w:t>
-      </w:r>
-    </w:p>
-    <w:p>
-      <w:pPr/>
-      <w:r>
-        <w:t>Context: Kubernetes/cloud/host discovery and evidence collection require tool sessions. A global CLI cache or an administrator's shell default would let one person's credential silently become everyone’s. The experience is based on OSHAL user login and the standard connection framework.</w:t>
-      </w:r>
-    </w:p>
-    <w:p>
-      <w:pPr/>
-      <w:r>
-        <w:t>Decision: Resolve admitted connections under the signed-in caller, with explicit named account and resource scope. Interactive connection authorization belongs to the shared secure flow. Unattended work requires explicit activation under an admitted principal and scoped connection; browser tokens and personal terminal caches are not background service credentials. This uses shared authority, not an independent Operations login. Personal connections and explicitly granted shared connections retain their native ownership distinctions.</w:t>
-      </w:r>
-    </w:p>
-    <w:p>
-      <w:pPr/>
-      <w:r>
-        <w:t>Verify runner/tool availability, actual principal, account/tenant/project/cluster incarnation and capability-specific reads. A login does not prove inventory, evidence or write access. Changed binding, expiry, revocation or wrong scope blocks new work. Shared refresh must preserve the bound identity. Tools receive isolated configuration and explicit target selection, without inheriting shell defaults.</w:t>
-      </w:r>
-    </w:p>
-    <w:p>
-      <w:pPr/>
-      <w:r>
-        <w:t>Alternatives rejected: application-owned OAuth/token storage, importing global CLI contexts, trusting client-supplied user IDs, all-powerful background credentials and granting writes after a read probe.</w:t>
-      </w:r>
-    </w:p>
-    <w:p>
-      <w:pPr/>
-      <w:r>
-        <w:t>Consequences: Connection and delegation metadata appear in topology freshness and collection receipts. Source/webhook authentication still applies independently to background deliveries. The scanner reconciles inventory only after a complete authorized scan; failure cannot delete unseen assets.</w:t>
-      </w:r>
-    </w:p>
-    <w:p>
-      <w:pPr/>
-      <w:r>
-        <w:t>Acceptance: Cross-user and cross-account refusal, missing tool, expired/revoked session, withdrawn grants, explicit target binding and no default fallback; prove an observer cannot mutate infrastructure. Use installed shared services and real disposable provider acceptance separately from local UX fixtures.</w:t>
+        <w:t>ADR 0003: External ticket synchronization uses standard connectors</w:t>
+      </w:r>
+    </w:p>
+    <w:p>
+      <w:pPr/>
+      <w:r>
+        <w:t>Status: Accepted design,20 October2026. ADR0025 implements a manual outbound handoff in source; unattended bidirectional synchronization remains open.</w:t>
+      </w:r>
+    </w:p>
+    <w:p>
+      <w:pPr/>
+      <w:r>
+        <w:t>Context: Inbound monitoring integrations and outbound ITSM/developer-ticket integrations serve different purposes. Teams need linked ServiceNow incidents, GitHub/GitLab issues and Jira issues while retaining one canonical OSHAL ticket. All use the signed-in user's standard connection authority.</w:t>
+      </w:r>
+    </w:p>
+    <w:p>
+      <w:pPr/>
+      <w:r>
+        <w:t>Decision: Configure inbound alert sources separately from outbound and optional bidirectional ticket sync. Reuse the standard connector catalog, per-user/named-account selection, shared-connection grants, secret references, confirmed write boundary, webhook verification and audit. Implement missing operations in that framework rather than direct app HTTP clients or a second credential system.</w:t>
+      </w:r>
+    </w:p>
+    <w:p>
+      <w:pPr/>
+      <w:r>
+        <w:t>A durable link identifies tenant/principal scope, canonical ticket, provider, connection/account, external record and revisions. Policy owns field direction, status mapping, comment handling and conflict resolution. Track origin markers and revisions to suppress echoes. A durable operation ledger reserves stable operation identity before writes. Reconcile unknown creates before retrying; if a provider cannot prove the outcome, retain a blocked/manual-review state rather than claiming exactly once. Remote ticket closure is not verified infrastructure recovery. Permission loss pauses synchronization.</w:t>
+      </w:r>
+    </w:p>
+    <w:p>
+      <w:pPr/>
+      <w:r>
+        <w:t>Source review: oshal-kernel/connectors contains all four declarations. ServiceNow currently declares GET resources only; GitHub declares confirmed create/comment actions and issue webhooks; GitLab/Jira resource declarations do not establish complete guarded bidirectional status sync. The actual native write signature takes a confirmed context in crates/connectors/src/actions.rs. Provider completeness, webhook verification and installed admission must be tested per operation, not inferred from ADR prose.</w:t>
+      </w:r>
+    </w:p>
+    <w:p>
+      <w:pPr/>
+      <w:r>
+        <w:t>Alternatives rejected: app-owned credentials, blind POST retries, duplicate local ticket engines, last-write-wins status overwrite, feedback loops and automatic incident recovery from remote closure.</w:t>
+      </w:r>
+    </w:p>
+    <w:p>
+      <w:pPr/>
+      <w:r>
+        <w:t>Acceptance: One canonical link, correct caller/account and target, denied write, expired/revoked connection, lost response after create, duplicate/reordered webhook, conflict, status mapping, echo suppression and comment redaction. Use disposable provider targets; never create real tickets as part of mockup review or local repository tests.</w:t>
+      </w:r>
+    </w:p>
+    <w:p>
+      <w:pPr/>
+      <w:r>
+        <w:t>The first manual implementation is documented in [ADR0025](0025-manual-workflow-ticket-handoff.md). It reserves a current canonical snapshot before confirmed native Actions and labels durable outcomes as operator reports. It does not complete the broader synchronization acceptance above.</w:t>
       </w:r>
     </w:p>
     <w:p>
@@ -1262,67 +1244,49 @@
         <w:pStyle w:val="Title"/>
       </w:pPr>
       <w:r>
-        <w:t>ADR 0005: Deploy the first persistent experience in an isolated native Kubernetes lab</w:t>
-      </w:r>
-    </w:p>
-    <w:p>
-      <w:pPr/>
-      <w:r>
-        <w:t>Status: Implemented first increment, 20 October 2026. Extends ADRs 0001, 0002 and 0004 without superseding their target architecture.</w:t>
-      </w:r>
-    </w:p>
-    <w:p>
-      <w:pPr/>
-      <w:r>
-        <w:t>Context: The experience must be tested with actual OSHAL sessions, grants, persistence and Kubernetes observations. The existing browser prototype cannot establish those properties. The full source-principal, detection and automation milestones remain larger than this first increment.</w:t>
-      </w:r>
-    </w:p>
-    <w:p>
-      <w:pPr/>
-      <w:r>
-        <w:t>Decision: Package the committed Operations application with the existing pinned native OSHAL runtime. Deploy the application and PostgreSQL in an owned local Kubernetes namespace with persistent volumes, native process sandboxing and loopback access. Preserve the shared kernel and existing incident specialists. Use native reader/operator roles and the kernel's person-scoped application store. No separate login, credential broker or ticket engine is introduced.</w:t>
-      </w:r>
-    </w:p>
-    <w:p>
-      <w:pPr/>
-      <w:r>
-        <w:t>Authenticate source registration and imports as the current operator. Save immutable mapping revisions and original/normalized alert records with explicit validation outcomes. Save bounded timestamped pod/container captures, preserving unknown readiness and native UIDs. Expose current-caller connection status through the standard framework. The same caller's records must survive pod replacement; another person must not inherit them.</w:t>
-      </w:r>
-    </w:p>
-    <w:p>
-      <w:pPr/>
-      <w:r>
-        <w:t>Alternatives rejected: static mockups presented as a deployment; a second identity service; app-owned cloud credentials; unsandboxed execution to bypass nested Kubernetes prerequisites; automatic ingestion or remediation claimed from a manual import test.</w:t>
-      </w:r>
-    </w:p>
-    <w:p>
-      <w:pPr/>
-      <w:r>
-        <w:t>Consequences: This is authenticated capture intake, not a background source identity contract. Exact payload retries share one record, but changed payloads, concurrent decision reservation, retained delivery attempts and the established noise algorithm remain M2/M4 work. Captures are historical namespace observations, not continuous discovery or a completed correlation graph. Provider/tool activation remains gated by ADR 0004. The initial runtime used a noop model and did not certify RCA inference. ADR0006 records subsequent model-account activation.</w:t>
-      </w:r>
-    </w:p>
-    <w:p>
-      <w:pPr/>
-      <w:r>
-        <w:t>Acceptance: Real native login and experience launch; unassigned/read-only refusal; person isolation; downgrade/revocation; actual source/event/quarantine and inventory forms; desktop and phone layouts; saved records after pod replacement; hash-verified real lab firing/resolved deliveries correlated to exact observed pod UIDs. Deployment and acceptance receipts identify the tested source revision. Production users, grants and default Kubernetes context are unchanged.</w:t>
-      </w:r>
-    </w:p>
-    <w:p>
-      <w:pPr/>
-      <w:r>
-        <w:t>Owner boundary: Application UI, records, contracts and isolated deployment harness belong here. Any missing connector, delegated runner or transactional primitive belongs to its shared owner and must be verified before dependent milestones are marked complete.</w:t>
-      </w:r>
-    </w:p>
-    <w:p>
-      <w:pPr/>
-      <w:r>
-        <w:t>Installation follow-through, 20 October: the kernel-owned local installer now starts a fresh kernel and database, sets the existing administrator's first password once, and loads selected public applications afterwards through the native loader. Initial credentials, desktop profile and application roles remain native framework concerns. The actual OSHAL Node portal window passed password sign-in with an isolated Kubernetes profile; existing bare-metal configuration was preserved. Token import is a separate unfinished shared-runtime contract: the three desktop vendor import routes returned 404 under an authenticated administrator. No token transfer or automatic desktop-worker enrollment is claimed. See IMPLEMENTATION-STATUS.md and kernel `deploy/k8s/local-install-evidence.json` for revision-specific checks.</w:t>
-      </w:r>
-    </w:p>
-    <w:p>
-      <w:pPr/>
-      <w:r>
-        <w:t>Subsequent delivery: ADR0006 supersedes the unfinished Codex/Claude import observation above with real installed transfer and model verification. Antigravity and infrastructure-worker acceptance are not implied.</w:t>
+        <w:t>ADR 0004: CLI and background work retain user-bound OSHAL authority</w:t>
+      </w:r>
+    </w:p>
+    <w:p>
+      <w:pPr/>
+      <w:r>
+        <w:t>Status: Accepted design, 20 October 2026. Provider/runner acceptance remains required.</w:t>
+      </w:r>
+    </w:p>
+    <w:p>
+      <w:pPr/>
+      <w:r>
+        <w:t>Context: Kubernetes/cloud/host discovery and evidence collection require tool sessions. A global CLI cache or an administrator's shell default would let one person's credential silently become everyone’s. The experience is based on OSHAL user login and the standard connection framework.</w:t>
+      </w:r>
+    </w:p>
+    <w:p>
+      <w:pPr/>
+      <w:r>
+        <w:t>Decision: Resolve admitted connections under the signed-in caller, with explicit named account and resource scope. Interactive connection authorization belongs to the shared secure flow. Unattended work requires explicit activation under an admitted principal and scoped connection; browser tokens and personal terminal caches are not background service credentials. This uses shared authority, not an independent Operations login. Personal connections and explicitly granted shared connections retain their native ownership distinctions.</w:t>
+      </w:r>
+    </w:p>
+    <w:p>
+      <w:pPr/>
+      <w:r>
+        <w:t>Verify runner/tool availability, actual principal, account/tenant/project/cluster incarnation and capability-specific reads. A login does not prove inventory, evidence or write access. Changed binding, expiry, revocation or wrong scope blocks new work. Shared refresh must preserve the bound identity. Tools receive isolated configuration and explicit target selection, without inheriting shell defaults.</w:t>
+      </w:r>
+    </w:p>
+    <w:p>
+      <w:pPr/>
+      <w:r>
+        <w:t>Alternatives rejected: application-owned OAuth/token storage, importing global CLI contexts, trusting client-supplied user IDs, all-powerful background credentials and granting writes after a read probe.</w:t>
+      </w:r>
+    </w:p>
+    <w:p>
+      <w:pPr/>
+      <w:r>
+        <w:t>Consequences: Connection and delegation metadata appear in topology freshness and collection receipts. Source/webhook authentication still applies independently to background deliveries. The scanner reconciles inventory only after a complete authorized scan; failure cannot delete unseen assets.</w:t>
+      </w:r>
+    </w:p>
+    <w:p>
+      <w:pPr/>
+      <w:r>
+        <w:t>Acceptance: Cross-user and cross-account refusal, missing tool, expired/revoked session, withdrawn grants, explicit target binding and no default fallback; prove an observer cannot mutate infrastructure. Use installed shared services and real disposable provider acceptance separately from local UX fixtures.</w:t>
       </w:r>
     </w:p>
     <w:p>
@@ -1330,61 +1294,67 @@
         <w:pStyle w:val="Title"/>
       </w:pPr>
       <w:r>
-        <w:t>ADR 0006: Select independent applications and shared communication transports</w:t>
-      </w:r>
-    </w:p>
-    <w:p>
-      <w:pPr/>
-      <w:r>
-        <w:t>Status: Accepted and partially delivered, 20 October 2026.</w:t>
-      </w:r>
-    </w:p>
-    <w:p>
-      <w:pPr/>
-      <w:r>
-        <w:t>Context: The hackathon installation needs Operations, Office, email and Telegram alerts, with Jarvis as its assistant. The broad Jarvis experience package requires Finance and many unrelated applications. Initial Kubernetes desktop transfers failed because native import routes were absent, although the bare-metal satellite had worked.</w:t>
-      </w:r>
-    </w:p>
-    <w:p>
-      <w:pPr/>
-      <w:r>
-        <w:t>Decision: Install the independent public `intelligent-operations`, `presentations` and `email-summarizer` packages after the kernel. Use built-in Jarvis and Workflow Studio. Trust the captured public origin before previewing and installing each exact artifact. Keep source identity, native sessions, account transfer, application grants, connections, notification preferences and delivery in the kernel's shared frameworks.</w:t>
-      </w:r>
-    </w:p>
-    <w:p>
-      <w:pPr/>
-      <w:r>
-        <w:t>Operations retains its operator role; Jarvis gets chat-user. Office and email currently use application tiers. Optional model accounts are imported only through the signed-in installation operator; a device enrollment credential cannot authorize the import. Choose the model explicitly after testing it. Shared runtime configuration is not permission to impersonate another user's mailbox or to perform an infrastructure action.</w:t>
-      </w:r>
-    </w:p>
-    <w:p>
-      <w:pPr/>
-      <w:r>
-        <w:t>Telegram is a separate native notification transport over fenced HTTPS. It follows the person's saved topic, numeric destination, mutes and quiet hours. A manual test send needs native confirmation and delivery is recorded only after Telegram acknowledges a message. Reuse the existing bot for outbound configuration without changing its webhook. Mail application credentials and mailbox sign-in are separate steps; the connector installer does not enable Google portal auto-provisioning.</w:t>
-      </w:r>
-    </w:p>
-    <w:p>
-      <w:pPr/>
-      <w:r>
-        <w:t>Alternatives rejected: installing the entire umbrella bundle; application-private tokens; database writes that bypass registry trust or role previews; treating a stored credential, configured bot or HTTP success as proof that an external message was delivered.</w:t>
-      </w:r>
-    </w:p>
-    <w:p>
-      <w:pPr/>
-      <w:r>
-        <w:t>Acceptance: Five active packages with no Finance; admitted app views; real desktop Codex and Claude transfers and model responses; actual locally generated Office artifact; visible disconnected-mailbox guidance; Telegram caller isolation, confirmation, bounded payload and acknowledgement tests. Keep live delivery, mailbox connection, automatic event notification production and full platform publication explicitly separate.</w:t>
-      </w:r>
-    </w:p>
-    <w:p>
-      <w:pPr/>
-      <w:r>
-        <w:t>Owner boundary: The store owns Operations' event producer and UX. The kernel owns the installer, notification rail and credentials. M2/M4 still own ingestion, filtering and the established reduction algorithm; this installation does not complete those milestones.</w:t>
-      </w:r>
-    </w:p>
-    <w:p>
-      <w:pPr/>
-      <w:r>
-        <w:t>21 October implementation refinement: the shared native notifier now has source-tested SMS and explicitly enabled short phone alerts (core ADR186/188). Brief calls use fixed escaped speech followed by hangup, a30-second ceiling and no recording; interactive Calling Assistant remains separate. Configure services through the standard private Kubernetes connector installer, and save destinations under the original person's topic preferences. The operator authorized exactly one SMS, one brief call and one Telegram test to existing destinations. The operator-side acceptance runner fsyncs each reservation before any possible send, holds lost acknowledgements and mutes test topics. Live acceptance remains pending the final kernel gate/rollout. No automatic alert campaign is authorized by that test.</w:t>
+        <w:t>ADR 0005: Deploy the first persistent experience in an isolated native Kubernetes lab</w:t>
+      </w:r>
+    </w:p>
+    <w:p>
+      <w:pPr/>
+      <w:r>
+        <w:t>Status: Implemented first increment, 20 October 2026. Extends ADRs 0001, 0002 and 0004 without superseding their target architecture.</w:t>
+      </w:r>
+    </w:p>
+    <w:p>
+      <w:pPr/>
+      <w:r>
+        <w:t>Context: The experience must be tested with actual OSHAL sessions, grants, persistence and Kubernetes observations. The existing browser prototype cannot establish those properties. The full source-principal, detection and automation milestones remain larger than this first increment.</w:t>
+      </w:r>
+    </w:p>
+    <w:p>
+      <w:pPr/>
+      <w:r>
+        <w:t>Decision: Package the committed Operations application with the existing pinned native OSHAL runtime. Deploy the application and PostgreSQL in an owned local Kubernetes namespace with persistent volumes, native process sandboxing and loopback access. Preserve the shared kernel and existing incident specialists. Use native reader/operator roles and the kernel's person-scoped application store. No separate login, credential broker or ticket engine is introduced.</w:t>
+      </w:r>
+    </w:p>
+    <w:p>
+      <w:pPr/>
+      <w:r>
+        <w:t>Authenticate source registration and imports as the current operator. Save immutable mapping revisions and original/normalized alert records with explicit validation outcomes. Save bounded timestamped pod/container captures, preserving unknown readiness and native UIDs. Expose current-caller connection status through the standard framework. The same caller's records must survive pod replacement; another person must not inherit them.</w:t>
+      </w:r>
+    </w:p>
+    <w:p>
+      <w:pPr/>
+      <w:r>
+        <w:t>Alternatives rejected: static mockups presented as a deployment; a second identity service; app-owned cloud credentials; unsandboxed execution to bypass nested Kubernetes prerequisites; automatic ingestion or remediation claimed from a manual import test.</w:t>
+      </w:r>
+    </w:p>
+    <w:p>
+      <w:pPr/>
+      <w:r>
+        <w:t>Consequences: This is authenticated capture intake, not a background source identity contract. Exact payload retries share one record, but changed payloads, concurrent decision reservation, retained delivery attempts and the established noise algorithm remain M2/M4 work. Captures are historical namespace observations, not continuous discovery or a completed correlation graph. Provider/tool activation remains gated by ADR 0004. The initial runtime used a noop model and did not certify RCA inference. ADR0006 records subsequent model-account activation.</w:t>
+      </w:r>
+    </w:p>
+    <w:p>
+      <w:pPr/>
+      <w:r>
+        <w:t>Acceptance: Real native login and experience launch; unassigned/read-only refusal; person isolation; downgrade/revocation; actual source/event/quarantine and inventory forms; desktop and phone layouts; saved records after pod replacement; hash-verified real lab firing/resolved deliveries correlated to exact observed pod UIDs. Deployment and acceptance receipts identify the tested source revision. Production users, grants and default Kubernetes context are unchanged.</w:t>
+      </w:r>
+    </w:p>
+    <w:p>
+      <w:pPr/>
+      <w:r>
+        <w:t>Owner boundary: Application UI, records, contracts and isolated deployment harness belong here. Any missing connector, delegated runner or transactional primitive belongs to its shared owner and must be verified before dependent milestones are marked complete.</w:t>
+      </w:r>
+    </w:p>
+    <w:p>
+      <w:pPr/>
+      <w:r>
+        <w:t>Installation follow-through, 20 October: the kernel-owned local installer now starts a fresh kernel and database, sets the existing administrator's first password once, and loads selected public applications afterwards through the native loader. Initial credentials, desktop profile and application roles remain native framework concerns. The actual OSHAL Node portal window passed password sign-in with an isolated Kubernetes profile; existing bare-metal configuration was preserved. Token import is a separate unfinished shared-runtime contract: the three desktop vendor import routes returned 404 under an authenticated administrator. No token transfer or automatic desktop-worker enrollment is claimed. See IMPLEMENTATION-STATUS.md and kernel `deploy/k8s/local-install-evidence.json` for revision-specific checks.</w:t>
+      </w:r>
+    </w:p>
+    <w:p>
+      <w:pPr/>
+      <w:r>
+        <w:t>Subsequent delivery: ADR0006 supersedes the unfinished Codex/Claude import observation above with real installed transfer and model verification. Antigravity and infrastructure-worker acceptance are not implied.</w:t>
       </w:r>
     </w:p>
     <w:p>
@@ -1392,61 +1362,61 @@
         <w:pStyle w:val="Title"/>
       </w:pPr>
       <w:r>
-        <w:t>ADR 0007: Durable processing before enrichment; anomaly detection is separate</w:t>
-      </w:r>
-    </w:p>
-    <w:p>
-      <w:pPr/>
-      <w:r>
-        <w:t>Status: Accepted design, 20 October 2026; services pending implementation. Extends ADR0002 after review of the archived processing source and operational notes.</w:t>
-      </w:r>
-    </w:p>
-    <w:p>
-      <w:pPr/>
-      <w:r>
-        <w:t>Decision: Preserve the established order: authenticated named source → durable raw delivery and separate telemetry → versioned mapping/identity → stored-query and window evaluation → scoped symptom reduction/reservation → bounded temporal correlation → conditional evidence packet → canonical ticket workflow → standard connector delivery and reconciliation. Repeated occurrences update counts before any new capture or model invocation is admitted.</w:t>
-      </w:r>
-    </w:p>
-    <w:p>
-      <w:pPr/>
-      <w:r>
-        <w:t>A separate anomaly service learns from bounded telemetry histories. Its output is an alert candidate containing detector identity/version, resource identity, window, baseline, score, confidence and readiness. That candidate enters the same filtering/reduction path as a source alert. Cold, stale, missing or failed detectors are explicit states, never normal health. Retain externally supplied anomaly results without claiming that importing or rescoring them provides local detection.</w:t>
-      </w:r>
-    </w:p>
-    <w:p>
-      <w:pPr/>
-      <w:r>
-        <w:t>Use native OSHAL identity, current-caller authorization, connection grants and canonical tickets. Application-owned services must not invent parallel users or bypass shared connector operations. Do not launch arbitrary functions or a separate function platform for inbound adapters. Keep raw deliveries, normalized alerts, telemetry, decisions, reservations/outbox and evidence references as distinct durable records, with retention and per-source quotas.</w:t>
-      </w:r>
-    </w:p>
-    <w:p>
-      <w:pPr/>
-      <w:r>
-        <w:t>Atomic admission/reservation must survive replicas and restart. A process-local cache is an optimization only. A delivery with uncertain external outcome stays pending reconciliation rather than being marked failed and blindly retried. Rule/backend failure is distinct from no match. Use compound cursors plus bounded overlap and idempotent writes for late/tied telemetry results.</w:t>
-      </w:r>
-    </w:p>
-    <w:p>
-      <w:pPr/>
-      <w:r>
-        <w:t>Correlation uses parameterized queries over scoped immutable asset IDs and time-valid edges. Bound depth, visited nodes/edges, elapsed time and output. Record direction and relationship policy. A failure may use a documented field-grouping fallback, clearly marked degraded.</w:t>
-      </w:r>
-    </w:p>
-    <w:p>
-      <w:pPr/>
-      <w:r>
-        <w:t>The evidence collector has narrowly granted read access. The investigation worker receives only the redacted packet and earlier phase outputs, without kubeconfig, source credentials or general cluster tools. Script proposals and human acceptance of the report do not authorize execution. Execution remains a separate registered action with exact artifact/target/current-authority checks.</w:t>
-      </w:r>
-    </w:p>
-    <w:p>
-      <w:pPr/>
-      <w:r>
-        <w:t>Alternatives rejected: deduplication only at the ticket sender; inferred source routing; unbounded graph joins; treating threshold alerts as anomaly detection; treating collection failure as healthy; memory-only reservations; silently advancing past failed records; silent automatic resend.</w:t>
-      </w:r>
-    </w:p>
-    <w:p>
-      <w:pPr/>
-      <w:r>
-        <w:t>Consequences: the hackathon has explicit failure paths and fewer claims of completeness. Service dependencies and all acceptance cases are tracked in PIPELINE-REVIEW.md and PROJECT-PLAN.md. Backend selection/pinning and detector calibration remain implementation work, not implicit approval of any archived infrastructure or credentials.</w:t>
+        <w:t>ADR 0006: Select independent applications and shared communication transports</w:t>
+      </w:r>
+    </w:p>
+    <w:p>
+      <w:pPr/>
+      <w:r>
+        <w:t>Status: Accepted and partially delivered, 20 October 2026.</w:t>
+      </w:r>
+    </w:p>
+    <w:p>
+      <w:pPr/>
+      <w:r>
+        <w:t>Context: The hackathon installation needs Operations, Office, email and Telegram alerts, with Jarvis as its assistant. The broad Jarvis experience package requires Finance and many unrelated applications. Initial Kubernetes desktop transfers failed because native import routes were absent, although the bare-metal satellite had worked.</w:t>
+      </w:r>
+    </w:p>
+    <w:p>
+      <w:pPr/>
+      <w:r>
+        <w:t>Decision: Install the independent public `intelligent-operations`, `presentations` and `email-summarizer` packages after the kernel. Use built-in Jarvis and Workflow Studio. Trust the captured public origin before previewing and installing each exact artifact. Keep source identity, native sessions, account transfer, application grants, connections, notification preferences and delivery in the kernel's shared frameworks.</w:t>
+      </w:r>
+    </w:p>
+    <w:p>
+      <w:pPr/>
+      <w:r>
+        <w:t>Operations retains its operator role; Jarvis gets chat-user. Office and email currently use application tiers. Optional model accounts are imported only through the signed-in installation operator; a device enrollment credential cannot authorize the import. Choose the model explicitly after testing it. Shared runtime configuration is not permission to impersonate another user's mailbox or to perform an infrastructure action.</w:t>
+      </w:r>
+    </w:p>
+    <w:p>
+      <w:pPr/>
+      <w:r>
+        <w:t>Telegram is a separate native notification transport over fenced HTTPS. It follows the person's saved topic, numeric destination, mutes and quiet hours. A manual test send needs native confirmation and delivery is recorded only after Telegram acknowledges a message. Reuse the existing bot for outbound configuration without changing its webhook. Mail application credentials and mailbox sign-in are separate steps; the connector installer does not enable Google portal auto-provisioning.</w:t>
+      </w:r>
+    </w:p>
+    <w:p>
+      <w:pPr/>
+      <w:r>
+        <w:t>Alternatives rejected: installing the entire umbrella bundle; application-private tokens; database writes that bypass registry trust or role previews; treating a stored credential, configured bot or HTTP success as proof that an external message was delivered.</w:t>
+      </w:r>
+    </w:p>
+    <w:p>
+      <w:pPr/>
+      <w:r>
+        <w:t>Acceptance: Five active packages with no Finance; admitted app views; real desktop Codex and Claude transfers and model responses; actual locally generated Office artifact; visible disconnected-mailbox guidance; Telegram caller isolation, confirmation, bounded payload and acknowledgement tests. Keep live delivery, mailbox connection, automatic event notification production and full platform publication explicitly separate.</w:t>
+      </w:r>
+    </w:p>
+    <w:p>
+      <w:pPr/>
+      <w:r>
+        <w:t>Owner boundary: The store owns Operations' event producer and UX. The kernel owns the installer, notification rail and credentials. M2/M4 still own ingestion, filtering and the established reduction algorithm; this installation does not complete those milestones.</w:t>
+      </w:r>
+    </w:p>
+    <w:p>
+      <w:pPr/>
+      <w:r>
+        <w:t>21 October implementation refinement: the shared native notifier now has source-tested SMS and explicitly enabled short phone alerts (core ADR186/188). Brief calls use fixed escaped speech followed by hangup, a30-second ceiling and no recording; interactive Calling Assistant remains separate. Configure services through the standard private Kubernetes connector installer, and save destinations under the original person's topic preferences. The operator authorized exactly one SMS, one brief call and one Telegram test to existing destinations. The operator-side acceptance runner fsyncs each reservation before any possible send, holds lost acknowledgements and mutes test topics. Live acceptance remains pending the final kernel gate/rollout. No automatic alert campaign is authorized by that test.</w:t>
       </w:r>
     </w:p>
     <w:p>
@@ -1454,49 +1424,61 @@
         <w:pStyle w:val="Title"/>
       </w:pPr>
       <w:r>
-        <w:t>ADR 0008: Reuse the reviewed topology structure with temporal identity</w:t>
-      </w:r>
-    </w:p>
-    <w:p>
-      <w:pPr/>
-      <w:r>
-        <w:t>Status: Accepted design, 20 October 2026. Bounded implementation and native lab acceptance are recorded in ADR0009 and the topology receipt; scheduled discovery and full P4 remain open. Basis: the operator explicitly directed review of the archived correlation database and load scripts. Extends ADR0002, ADR0004 and ADR0007.</w:t>
-      </w:r>
-    </w:p>
-    <w:p>
-      <w:pPr/>
-      <w:r>
-        <w:t>Decision: Use the host/service, AWS network and Kubernetes topology loaders as the initial entity and relationship model. The source trace and normalized relationship directions are recorded in [GRAPH-STRUCTURE.md](../GRAPH-STRUCTURE.md). Retain collection batching, source provenance, full-scan generations and explicit typed relationships. Keep the new application vocabulary neutral.</w:t>
-      </w:r>
-    </w:p>
-    <w:p>
-      <w:pPr/>
-      <w:r>
-        <w:t>Use native resource identities scoped to their authorized account/project/cluster. Names and IP addresses are aliases, not identity. Preserve actual Kubernetes owner-reference chains. Maintain observation and validity times for nodes and edges so correlation reads the topology relevant to the event. A completed, scoped generation may retire missing observations; partial or failed scans may not. Stamp freshness only on records actually observed in that scan.</w:t>
-      </w:r>
-    </w:p>
-    <w:p>
-      <w:pPr/>
-      <w:r>
-        <w:t>Separate containment, ownership, placement, routing and evidenced dependency relationships. Correlation traverses an explicit versioned direction/type policy with budgets. Sharing a region, datacenter or broad network hub does not alone establish a common incident.</w:t>
-      </w:r>
-    </w:p>
-    <w:p>
-      <w:pPr/>
-      <w:r>
-        <w:t>Alternatives rejected: rebuilding the domain structure without reviewing the existing loaders; copying their estate-specific configuration; using pod names as instance keys; deleting graph relationships before a partial reload; stamping every old record fresh after one scan; treating all historical links as causal dependency or choosing the database engine from a document title.</w:t>
-      </w:r>
-    </w:p>
-    <w:p>
-      <w:pPr/>
-      <w:r>
-        <w:t>The application owns the normalized graph contract and correlation policy. The kernel owns identity, scheduler activation, caller-bound connections and authorized execution. Database engine and hardware compatibility remain implementation validation, not implicit approval of an archived image or deployment.</w:t>
-      </w:r>
-    </w:p>
-    <w:p>
-      <w:pPr/>
-      <w:r>
-        <w:t>Acceptance: provider/account collision, same-name pod replacement, real owner chains, namespace selector matching, autoscaling and movement, partial/failed scan preservation, interrupted generation replay, stale edges, direction, cycles, shared hubs, event-time topology and traversal limits. These remain M3/P4 acceptance gates and must be evidenced through the installed experience.</w:t>
+        <w:t>ADR 0007: Durable processing before enrichment; anomaly detection is separate</w:t>
+      </w:r>
+    </w:p>
+    <w:p>
+      <w:pPr/>
+      <w:r>
+        <w:t>Status: Accepted design, 20 October 2026; services pending implementation. Extends ADR0002 after review of the archived processing source and operational notes.</w:t>
+      </w:r>
+    </w:p>
+    <w:p>
+      <w:pPr/>
+      <w:r>
+        <w:t>Decision: Preserve the established order: authenticated named source → durable raw delivery and separate telemetry → versioned mapping/identity → stored-query and window evaluation → scoped symptom reduction/reservation → bounded temporal correlation → conditional evidence packet → canonical ticket workflow → standard connector delivery and reconciliation. Repeated occurrences update counts before any new capture or model invocation is admitted.</w:t>
+      </w:r>
+    </w:p>
+    <w:p>
+      <w:pPr/>
+      <w:r>
+        <w:t>A separate anomaly service learns from bounded telemetry histories. Its output is an alert candidate containing detector identity/version, resource identity, window, baseline, score, confidence and readiness. That candidate enters the same filtering/reduction path as a source alert. Cold, stale, missing or failed detectors are explicit states, never normal health. Retain externally supplied anomaly results without claiming that importing or rescoring them provides local detection.</w:t>
+      </w:r>
+    </w:p>
+    <w:p>
+      <w:pPr/>
+      <w:r>
+        <w:t>Use native OSHAL identity, current-caller authorization, connection grants and canonical tickets. Application-owned services must not invent parallel users or bypass shared connector operations. Do not launch arbitrary functions or a separate function platform for inbound adapters. Keep raw deliveries, normalized alerts, telemetry, decisions, reservations/outbox and evidence references as distinct durable records, with retention and per-source quotas.</w:t>
+      </w:r>
+    </w:p>
+    <w:p>
+      <w:pPr/>
+      <w:r>
+        <w:t>Atomic admission/reservation must survive replicas and restart. A process-local cache is an optimization only. A delivery with uncertain external outcome stays pending reconciliation rather than being marked failed and blindly retried. Rule/backend failure is distinct from no match. Use compound cursors plus bounded overlap and idempotent writes for late/tied telemetry results.</w:t>
+      </w:r>
+    </w:p>
+    <w:p>
+      <w:pPr/>
+      <w:r>
+        <w:t>Correlation uses parameterized queries over scoped immutable asset IDs and time-valid edges. Bound depth, visited nodes/edges, elapsed time and output. Record direction and relationship policy. A failure may use a documented field-grouping fallback, clearly marked degraded.</w:t>
+      </w:r>
+    </w:p>
+    <w:p>
+      <w:pPr/>
+      <w:r>
+        <w:t>The evidence collector has narrowly granted read access. The investigation worker receives only the redacted packet and earlier phase outputs, without kubeconfig, source credentials or general cluster tools. Script proposals and human acceptance of the report do not authorize execution. Execution remains a separate registered action with exact artifact/target/current-authority checks.</w:t>
+      </w:r>
+    </w:p>
+    <w:p>
+      <w:pPr/>
+      <w:r>
+        <w:t>Alternatives rejected: deduplication only at the ticket sender; inferred source routing; unbounded graph joins; treating threshold alerts as anomaly detection; treating collection failure as healthy; memory-only reservations; silently advancing past failed records; silent automatic resend.</w:t>
+      </w:r>
+    </w:p>
+    <w:p>
+      <w:pPr/>
+      <w:r>
+        <w:t>Consequences: the hackathon has explicit failure paths and fewer claims of completeness. Service dependencies and all acceptance cases are tracked in PIPELINE-REVIEW.md and PROJECT-PLAN.md. Backend selection/pinning and detector calibration remain implementation work, not implicit approval of any archived infrastructure or credentials.</w:t>
       </w:r>
     </w:p>
     <w:p>
@@ -1504,49 +1486,49 @@
         <w:pStyle w:val="Title"/>
       </w:pPr>
       <w:r>
-        <w:t>ADR 0009: Implement the bounded temporal graph on native scoped SQL</w:t>
-      </w:r>
-    </w:p>
-    <w:p>
-      <w:pPr/>
-      <w:r>
-        <w:t>Status: Accepted implementation decision, 20 October 2026. Extends ADR0008.</w:t>
-      </w:r>
-    </w:p>
-    <w:p>
-      <w:pPr/>
-      <w:r>
-        <w:t>Use the kernel's existing caller-scoped transactional SQL service for immutable inventory scan records and saved correlation decisions. Reconstruct the selected observation time in application code with explicit directed relationships. This provides the reviewed domain structure without adding an archived graph database image or a separate identity service to the installation.</w:t>
-      </w:r>
-    </w:p>
-    <w:p>
-      <w:pPr/>
-      <w:r>
-        <w:t>Each collection belongs to a named source. Provider, native account/project/cluster scope, kind and native resource ID determine an asset identity. A complete scan replaces that collection's current observations; partial scans preserve previously observed facts with their original timestamps. Immutable generations preserve history and permit late delivery. A repeated scan ID with different content or two distinct scans at the same collection timestamp is refused. Retries are transactional.</w:t>
-      </w:r>
-    </w:p>
-    <w:p>
-      <w:pPr/>
-      <w:r>
-        <w:t>Correlation joins only affected assets connected by an explicitly allowed directed dependency path. An unaffected common hub does not merge its dependents. Partial collections, missing/stale assets, unavailable relevant relationships and exhausted traversal budgets produce a visible degraded result with exact-asset grouping only. Decisions record the policy, selected deliveries, graph revision, scan IDs and paths. Saving a decision does not dispatch a ticket or authorize execution.</w:t>
-      </w:r>
-    </w:p>
-    <w:p>
-      <w:pPr/>
-      <w:r>
-        <w:t>This first implementation admits 256 assets and 512 edges in a 64 KiB scan, reconstructs at most 200 scans / 2,000 assets / 5,000 edges, and bounds traversal depth and visits. Exceeding a bound fails explicitly. It does not silently truncate a graph or certify an incomplete result. Production retention/checkpointing and a larger graph backend remain open; the common contract isolates that later choice. A collection that exceeds a bound must be narrowed before capture.</w:t>
-      </w:r>
-    </w:p>
-    <w:p>
-      <w:pPr/>
-      <w:r>
-        <w:t>The initial loader is an operator-run, guarded Kubernetes lab capture. It reads actual native UIDs, ownerReferences, container runtime IDs and EndpointSlice targets, excluding arbitrary pod fields. It is not a periodic scanner or a worker with general cluster access. AWS/Azure/GCP discovery, source conflict resolution, scheduled collection under service grants, automatic suppression integration and original-event-time policy selection remain subsequent work.</w:t>
-      </w:r>
-    </w:p>
-    <w:p>
-      <w:pPr/>
-      <w:r>
-        <w:t>Validation: real PostgreSQL transaction/isolation/browser contracts plus installed native API acceptance. PostgreSQL results alone do not establish native deployment acceptance.</w:t>
+        <w:t>ADR 0008: Reuse the reviewed topology structure with temporal identity</w:t>
+      </w:r>
+    </w:p>
+    <w:p>
+      <w:pPr/>
+      <w:r>
+        <w:t>Status: Accepted design, 20 October 2026. Bounded implementation and native lab acceptance are recorded in ADR0009 and the topology receipt; scheduled discovery and full P4 remain open. Basis: the operator explicitly directed review of the archived correlation database and load scripts. Extends ADR0002, ADR0004 and ADR0007.</w:t>
+      </w:r>
+    </w:p>
+    <w:p>
+      <w:pPr/>
+      <w:r>
+        <w:t>Decision: Use the host/service, AWS network and Kubernetes topology loaders as the initial entity and relationship model. The source trace and normalized relationship directions are recorded in [GRAPH-STRUCTURE.md](../GRAPH-STRUCTURE.md). Retain collection batching, source provenance, full-scan generations and explicit typed relationships. Keep the new application vocabulary neutral.</w:t>
+      </w:r>
+    </w:p>
+    <w:p>
+      <w:pPr/>
+      <w:r>
+        <w:t>Use native resource identities scoped to their authorized account/project/cluster. Names and IP addresses are aliases, not identity. Preserve actual Kubernetes owner-reference chains. Maintain observation and validity times for nodes and edges so correlation reads the topology relevant to the event. A completed, scoped generation may retire missing observations; partial or failed scans may not. Stamp freshness only on records actually observed in that scan.</w:t>
+      </w:r>
+    </w:p>
+    <w:p>
+      <w:pPr/>
+      <w:r>
+        <w:t>Separate containment, ownership, placement, routing and evidenced dependency relationships. Correlation traverses an explicit versioned direction/type policy with budgets. Sharing a region, datacenter or broad network hub does not alone establish a common incident.</w:t>
+      </w:r>
+    </w:p>
+    <w:p>
+      <w:pPr/>
+      <w:r>
+        <w:t>Alternatives rejected: rebuilding the domain structure without reviewing the existing loaders; copying their estate-specific configuration; using pod names as instance keys; deleting graph relationships before a partial reload; stamping every old record fresh after one scan; treating all historical links as causal dependency or choosing the database engine from a document title.</w:t>
+      </w:r>
+    </w:p>
+    <w:p>
+      <w:pPr/>
+      <w:r>
+        <w:t>The application owns the normalized graph contract and correlation policy. The kernel owns identity, scheduler activation, caller-bound connections and authorized execution. Database engine and hardware compatibility remain implementation validation, not implicit approval of an archived image or deployment.</w:t>
+      </w:r>
+    </w:p>
+    <w:p>
+      <w:pPr/>
+      <w:r>
+        <w:t>Acceptance: provider/account collision, same-name pod replacement, real owner chains, namespace selector matching, autoscaling and movement, partial/failed scan preservation, interrupted generation replay, stale edges, direction, cycles, shared hubs, event-time topology and traversal limits. These remain M3/P4 acceptance gates and must be evidenced through the installed experience.</w:t>
       </w:r>
     </w:p>
     <w:p>
@@ -1554,55 +1536,49 @@
         <w:pStyle w:val="Title"/>
       </w:pPr>
       <w:r>
-        <w:t>ADR 0010: Publish immutable rules before transactional symptom reduction</w:t>
-      </w:r>
-    </w:p>
-    <w:p>
-      <w:pPr/>
-      <w:r>
-        <w:t>Status: Implemented in source; installed acceptance is recorded separately in IMPLEMENTATION-STATUS.md. Extends ADR0002, ADR0007 and ADR0009. Owner: Operations package; P2/P3/M4.</w:t>
-      </w:r>
-    </w:p>
-    <w:p>
-      <w:pPr/>
-      <w:r>
-        <w:t>Use an actual OpenSearch percolator behind the existing kernel `engine.exchange` relay. The operator pins the package engine endpoint. The package derives its owner scope from the current verified user, checks the engine build digest, and exposes only health, publish and match commands. The engine has no Kubernetes credentials or command execution interface. General HTTP egress exceptions and another kernel adapter are unnecessary.</w:t>
-      </w:r>
-    </w:p>
-    <w:p>
-      <w:pPr/>
-      <w:r>
-        <w:t>Publish 1–128 bounded stored queries into an immutable owner/policy index, validate every write and count, then seal the index before activating its SQL source binding with a revision check. Matching exhausts all result pages with an exact count. Timeouts, partial shards, missing indexes, build mismatch and transport failures are failed attempts; they never mean an unmatched event. An unsuccessful activation can leave an unused immutable index; cleanup/retention remains required.</w:t>
-      </w:r>
-    </w:p>
-    <w:p>
-      <w:pPr/>
-      <w:r>
-        <w:t>Within one caller-scoped transaction, record the rule decision, symptom occurrence, current count, processing state and evidence-work reservation. Identity includes policy family and the validated source/environment/resource-kind/scope/native-ID/alert-type tuple. The source tuple remains distinct from graph-based incident membership. Replaying the same delivery under another revision of that policy family does not count it twice or create another reservation. Renaming the policy creates a new family and must be a deliberate operator choice.</w:t>
-      </w:r>
-    </w:p>
-    <w:p>
-      <w:pPr/>
-      <w:r>
-        <w:t>Window mode is explicitly fixed or sliding, from 1 to 86400 seconds. New episodes and a rise above an episode's highest severity reserve evidence work before expensive collection or investigation. Event time prevents late and same-time conflicting states from overwriting the latest source state. Receipt time controls the suppression window. A resolved source event can update its existing symptom even when firing-only rules do not match; it does not attest recovery or close a ticket. A reservation records whether its matched rules request a snapshot, and never authorizes execution.</w:t>
-      </w:r>
-    </w:p>
-    <w:p>
-      <w:pPr/>
-      <w:r>
-        <w:t>Reject copying process-local reservations, partial persistent keys, successful-looking backend fallbacks, first-page-only matches, or suppression after model investigation from the archive. Retain its scoped key/window/reserve-before-dispatch process with durable transaction semantics.</w:t>
-      </w:r>
-    </w:p>
-    <w:p>
-      <w:pPr/>
-      <w:r>
-        <w:t>Acceptance uses real PostgreSQL, two independent SQL pools, real OpenSearch and the shipped browser assets: pagination, disabled rules, rejected publication, revision races, 100 occurrences/one reservation, replay, owner isolation, window boundaries, escalation, late resolution, rollback and lost commit acknowledgement. Named protocol fault seams separately test timeout/partial-page refusal. Installed native SQL and relay behavior require their own Kubernetes receipt.</w:t>
-      </w:r>
-    </w:p>
-    <w:p>
-      <w:pPr/>
-      <w:r>
-        <w:t>This increment is operator-triggered evaluation of recorded normalized alerts. Durable OTLP telemetry, time-window aggregation, anomaly detection, background queue consumption, evidence reservation consumers and ticket dispatch remain separate delivery gates.</w:t>
+        <w:t>ADR 0009: Implement the bounded temporal graph on native scoped SQL</w:t>
+      </w:r>
+    </w:p>
+    <w:p>
+      <w:pPr/>
+      <w:r>
+        <w:t>Status: Accepted implementation decision, 20 October 2026. Extends ADR0008.</w:t>
+      </w:r>
+    </w:p>
+    <w:p>
+      <w:pPr/>
+      <w:r>
+        <w:t>Use the kernel's existing caller-scoped transactional SQL service for immutable inventory scan records and saved correlation decisions. Reconstruct the selected observation time in application code with explicit directed relationships. This provides the reviewed domain structure without adding an archived graph database image or a separate identity service to the installation.</w:t>
+      </w:r>
+    </w:p>
+    <w:p>
+      <w:pPr/>
+      <w:r>
+        <w:t>Each collection belongs to a named source. Provider, native account/project/cluster scope, kind and native resource ID determine an asset identity. A complete scan replaces that collection's current observations; partial scans preserve previously observed facts with their original timestamps. Immutable generations preserve history and permit late delivery. A repeated scan ID with different content or two distinct scans at the same collection timestamp is refused. Retries are transactional.</w:t>
+      </w:r>
+    </w:p>
+    <w:p>
+      <w:pPr/>
+      <w:r>
+        <w:t>Correlation joins only affected assets connected by an explicitly allowed directed dependency path. An unaffected common hub does not merge its dependents. Partial collections, missing/stale assets, unavailable relevant relationships and exhausted traversal budgets produce a visible degraded result with exact-asset grouping only. Decisions record the policy, selected deliveries, graph revision, scan IDs and paths. Saving a decision does not dispatch a ticket or authorize execution.</w:t>
+      </w:r>
+    </w:p>
+    <w:p>
+      <w:pPr/>
+      <w:r>
+        <w:t>This first implementation admits 256 assets and 512 edges in a 64 KiB scan, reconstructs at most 200 scans / 2,000 assets / 5,000 edges, and bounds traversal depth and visits. Exceeding a bound fails explicitly. It does not silently truncate a graph or certify an incomplete result. Production retention/checkpointing and a larger graph backend remain open; the common contract isolates that later choice. A collection that exceeds a bound must be narrowed before capture.</w:t>
+      </w:r>
+    </w:p>
+    <w:p>
+      <w:pPr/>
+      <w:r>
+        <w:t>The initial loader is an operator-run, guarded Kubernetes lab capture. It reads actual native UIDs, ownerReferences, container runtime IDs and EndpointSlice targets, excluding arbitrary pod fields. It is not a periodic scanner or a worker with general cluster access. AWS/Azure/GCP discovery, source conflict resolution, scheduled collection under service grants, automatic suppression integration and original-event-time policy selection remain subsequent work.</w:t>
+      </w:r>
+    </w:p>
+    <w:p>
+      <w:pPr/>
+      <w:r>
+        <w:t>Validation: real PostgreSQL transaction/isolation/browser contracts plus installed native API acceptance. PostgreSQL results alone do not establish native deployment acceptance.</w:t>
       </w:r>
     </w:p>
     <w:p>
@@ -1610,43 +1586,55 @@
         <w:pStyle w:val="Title"/>
       </w:pPr>
       <w:r>
-        <w:t>ADR 0011: Restore the standard shared workspace installation</w:t>
-      </w:r>
-    </w:p>
-    <w:p>
-      <w:pPr/>
-      <w:r>
-        <w:t>Status: Standard installation restored (`a3de02d`, `18b68cd`); artifact/approval implementation published (`aac99fb`). Installed experience acceptance is tracked in IMPLEMENTATION-STATUS.md. Owner: native installation and workflow runtime. Extends ADR0001 and ADR0005.</w:t>
-      </w:r>
-    </w:p>
-    <w:p>
-      <w:pPr/>
-      <w:r>
-        <w:t>The operator requires the existing OSHAL shared workspace, not an Operations-specific file service. The reference Helm chart already declares `oshal-workspace`, retains it on Helm uninstall, and mounts it at `/app/workspace-shared` for API and bot pods. The native Kubernetes installer omitted that contract. Restore the claim and workspace environment aliases in the standard installation, with a storage-only upgrade that preserves users, applications, provider settings and existing claim capacity.</w:t>
-      </w:r>
-    </w:p>
-    <w:p>
-      <w:pPr/>
-      <w:r>
-        <w:t>Kernel and bot workers use that claim. Each worker stages only its admitted task in its private node directory; the agent sandbox does not expose the whole share, node enrollment Secret, provider credentials or Kubernetes credentials. RWO storage requires co-location on its node. Use RWX storage for workers distributed across nodes. The retention annotation does not protect a PVC from namespace deletion.</w:t>
-      </w:r>
-    </w:p>
-    <w:p>
-      <w:pPr/>
-      <w:r>
-        <w:t>The workflow produces deliverables through its existing executor. The native broker produces an answer artifact. Named CLI workers already capture actual file changes, a change manifest and the answer with hashes. Do not parse prose into pretend files, substitute assistant-written scripts, or present supplied proposal inputs as generated remediation. Preserve the producing ticket, work, phase, bot and content provenance.</w:t>
-      </w:r>
-    </w:p>
-    <w:p>
-      <w:pPr/>
-      <w:r>
-        <w:t>The standard runtime stores accepted output and projects its exact bytes onto the PVC before advancing the workflow. Downloads retain original-caller access checks. The UI must distinguish unavailable storage/results from an empty workspace and must not invent an installed Code Server endpoint. Accepted history remains readable after a source revision update under current ownership, active application/bot and uncancelled authority checks; execution still requires the original exact generation.</w:t>
-      </w:r>
-    </w:p>
-    <w:p>
-      <w:pPr/>
-      <w:r>
-        <w:t>Approval goes through the native confirmed ticket approval endpoint and displays its returned state. Approving an investigation/report is not evidence that a remediation ran. Exact remediation approval, constrained execution and measured recovery remain separate acceptance gates.</w:t>
+        <w:t>ADR 0010: Publish immutable rules before transactional symptom reduction</w:t>
+      </w:r>
+    </w:p>
+    <w:p>
+      <w:pPr/>
+      <w:r>
+        <w:t>Status: Implemented in source; installed acceptance is recorded separately in IMPLEMENTATION-STATUS.md. Extends ADR0002, ADR0007 and ADR0009. Owner: Operations package; P2/P3/M4.</w:t>
+      </w:r>
+    </w:p>
+    <w:p>
+      <w:pPr/>
+      <w:r>
+        <w:t>Use an actual OpenSearch percolator behind the existing kernel `engine.exchange` relay. The operator pins the package engine endpoint. The package derives its owner scope from the current verified user, checks the engine build digest, and exposes only health, publish and match commands. The engine has no Kubernetes credentials or command execution interface. General HTTP egress exceptions and another kernel adapter are unnecessary.</w:t>
+      </w:r>
+    </w:p>
+    <w:p>
+      <w:pPr/>
+      <w:r>
+        <w:t>Publish 1–128 bounded stored queries into an immutable owner/policy index, validate every write and count, then seal the index before activating its SQL source binding with a revision check. Matching exhausts all result pages with an exact count. Timeouts, partial shards, missing indexes, build mismatch and transport failures are failed attempts; they never mean an unmatched event. An unsuccessful activation can leave an unused immutable index; cleanup/retention remains required.</w:t>
+      </w:r>
+    </w:p>
+    <w:p>
+      <w:pPr/>
+      <w:r>
+        <w:t>Within one caller-scoped transaction, record the rule decision, symptom occurrence, current count, processing state and evidence-work reservation. Identity includes policy family and the validated source/environment/resource-kind/scope/native-ID/alert-type tuple. The source tuple remains distinct from graph-based incident membership. Replaying the same delivery under another revision of that policy family does not count it twice or create another reservation. Renaming the policy creates a new family and must be a deliberate operator choice.</w:t>
+      </w:r>
+    </w:p>
+    <w:p>
+      <w:pPr/>
+      <w:r>
+        <w:t>Window mode is explicitly fixed or sliding, from 1 to 86400 seconds. New episodes and a rise above an episode's highest severity reserve evidence work before expensive collection or investigation. Event time prevents late and same-time conflicting states from overwriting the latest source state. Receipt time controls the suppression window. A resolved source event can update its existing symptom even when firing-only rules do not match; it does not attest recovery or close a ticket. A reservation records whether its matched rules request a snapshot, and never authorizes execution.</w:t>
+      </w:r>
+    </w:p>
+    <w:p>
+      <w:pPr/>
+      <w:r>
+        <w:t>Reject copying process-local reservations, partial persistent keys, successful-looking backend fallbacks, first-page-only matches, or suppression after model investigation from the archive. Retain its scoped key/window/reserve-before-dispatch process with durable transaction semantics.</w:t>
+      </w:r>
+    </w:p>
+    <w:p>
+      <w:pPr/>
+      <w:r>
+        <w:t>Acceptance uses real PostgreSQL, two independent SQL pools, real OpenSearch and the shipped browser assets: pagination, disabled rules, rejected publication, revision races, 100 occurrences/one reservation, replay, owner isolation, window boundaries, escalation, late resolution, rollback and lost commit acknowledgement. Named protocol fault seams separately test timeout/partial-page refusal. Installed native SQL and relay behavior require their own Kubernetes receipt.</w:t>
+      </w:r>
+    </w:p>
+    <w:p>
+      <w:pPr/>
+      <w:r>
+        <w:t>This increment is operator-triggered evaluation of recorded normalized alerts. Durable OTLP telemetry, time-window aggregation, anomaly detection, background queue consumption, evidence reservation consumers and ticket dispatch remain separate delivery gates.</w:t>
       </w:r>
     </w:p>
     <w:p>
@@ -1654,37 +1642,43 @@
         <w:pStyle w:val="Title"/>
       </w:pPr>
       <w:r>
-        <w:t>ADR 0012: Application-defined cockpit navigation</w:t>
-      </w:r>
-    </w:p>
-    <w:p>
-      <w:pPr/>
-      <w:r>
-        <w:t>Status: Implemented; installed acceptance recorded in IMPLEMENTATION-STATUS.md.</w:t>
-      </w:r>
-    </w:p>
-    <w:p>
-      <w:pPr/>
-      <w:r>
-        <w:t>The Operations ticket link opened the global cockpit without `app=intelligent-operations`. The global framework profile also returned every static application tile without checking whether its provider was installed, active and admitted to the current person.</w:t>
-      </w:r>
-    </w:p>
-    <w:p>
-      <w:pPr/>
-      <w:r>
-        <w:t>Use the existing application manifest contract. Operations `ui.static` declares its Overview, Topology, Data pipeline, Sources and Workflow Studio destinations; `ribbon.hideFrameworkItems` retains the canonical Tickets view and excludes unrelated framework workbenches. Ticket links preserve `/cockpit/?app=intelligent-operations&amp;ticket=…`. The shell resolves the declared default tool name to its registered view identifier. Workflow Studio appears only when its owning application is active and admitted.</w:t>
-      </w:r>
-    </w:p>
-    <w:p>
-      <w:pPr/>
-      <w:r>
-        <w:t>Global toolbar links use the same current route-owner admission as application tiles. An administrator does not get links to unloaded applications merely by being an administrator. Native Files, Security Center, Test Lab and Eval Wall remain kernel pages with their existing reader/operator checks. The Apps menu continues to use current admitted workspace discovery. Hidden navigation never substitutes for route authorization, which is checked again on use.</w:t>
-      </w:r>
-    </w:p>
-    <w:p>
-      <w:pPr/>
-      <w:r>
-        <w:t>This changes navigation and context retention; it does not implement missing telemetry, anomaly detection, generated remediation or automated infrastructure execution.</w:t>
+        <w:t>ADR 0011: Restore the standard shared workspace installation</w:t>
+      </w:r>
+    </w:p>
+    <w:p>
+      <w:pPr/>
+      <w:r>
+        <w:t>Status: Standard installation restored (`a3de02d`, `18b68cd`); artifact/approval implementation published (`aac99fb`). Installed experience acceptance is tracked in IMPLEMENTATION-STATUS.md. Owner: native installation and workflow runtime. Extends ADR0001 and ADR0005.</w:t>
+      </w:r>
+    </w:p>
+    <w:p>
+      <w:pPr/>
+      <w:r>
+        <w:t>The operator requires the existing OSHAL shared workspace, not an Operations-specific file service. The reference Helm chart already declares `oshal-workspace`, retains it on Helm uninstall, and mounts it at `/app/workspace-shared` for API and bot pods. The native Kubernetes installer omitted that contract. Restore the claim and workspace environment aliases in the standard installation, with a storage-only upgrade that preserves users, applications, provider settings and existing claim capacity.</w:t>
+      </w:r>
+    </w:p>
+    <w:p>
+      <w:pPr/>
+      <w:r>
+        <w:t>Kernel and bot workers use that claim. Each worker stages only its admitted task in its private node directory; the agent sandbox does not expose the whole share, node enrollment Secret, provider credentials or Kubernetes credentials. RWO storage requires co-location on its node. Use RWX storage for workers distributed across nodes. The retention annotation does not protect a PVC from namespace deletion.</w:t>
+      </w:r>
+    </w:p>
+    <w:p>
+      <w:pPr/>
+      <w:r>
+        <w:t>The workflow produces deliverables through its existing executor. The native broker produces an answer artifact. Named CLI workers already capture actual file changes, a change manifest and the answer with hashes. Do not parse prose into pretend files, substitute assistant-written scripts, or present supplied proposal inputs as generated remediation. Preserve the producing ticket, work, phase, bot and content provenance.</w:t>
+      </w:r>
+    </w:p>
+    <w:p>
+      <w:pPr/>
+      <w:r>
+        <w:t>The standard runtime stores accepted output and projects its exact bytes onto the PVC before advancing the workflow. Downloads retain original-caller access checks. The UI must distinguish unavailable storage/results from an empty workspace and must not invent an installed Code Server endpoint. Accepted history remains readable after a source revision update under current ownership, active application/bot and uncancelled authority checks; execution still requires the original exact generation.</w:t>
+      </w:r>
+    </w:p>
+    <w:p>
+      <w:pPr/>
+      <w:r>
+        <w:t>Approval goes through the native confirmed ticket approval endpoint and displays its returned state. Approving an investigation/report is not evidence that a remediation ran. Exact remediation approval, constrained execution and measured recovery remain separate acceptance gates.</w:t>
       </w:r>
     </w:p>
     <w:p>
@@ -1692,49 +1686,37 @@
         <w:pStyle w:val="Title"/>
       </w:pPr>
       <w:r>
-        <w:t>ADR 0013: Inspectable graph and processing cohorts</w:t>
-      </w:r>
-    </w:p>
-    <w:p>
-      <w:pPr/>
-      <w:r>
-        <w:t>Status: Implemented and verified in the local Kubernetes experience; receipt in `deploy/evidence/detection.json`.</w:t>
-      </w:r>
-    </w:p>
-    <w:p>
-      <w:pPr/>
-      <w:r>
-        <w:t>The experience must explain what survived filtering, deduplication and correlation. Counters without shared provenance or raw JSON alone do not provide that explanation.</w:t>
-      </w:r>
-    </w:p>
-    <w:p>
-      <w:pPr/>
-      <w:r>
-        <w:t>The Graph explorer loads the caller's reconstructed inventory and presents searchable, typed, keyboard-accessible nodes. Selecting a node opens its directed relationships, health observation, native identity, scope and source evidence. The overview renders at most 100 matching nodes and states the truncation; source reconstruction budgets remain unchanged. Missing nodes are not inferred to be deleted after partial collection.</w:t>
-      </w:r>
-    </w:p>
-    <w:p>
-      <w:pPr/>
-      <w:r>
-        <w:t>The processing flow uses one latest returned decision per delivery. Its incoming cohort, percolator matches and new/escalated symptoms share that denominator. It displays both fractions and counts, with event drill-downs and separate unmatched/suppressed states. These are latest returned pages, not installation totals or a live throughput claim. Policy replay does not increase a delivery count. Correlation coverage is shown separately because analyses can overlap and cannot safely be added together.</w:t>
-      </w:r>
-    </w:p>
-    <w:p>
-      <w:pPr/>
-      <w:r>
-        <w:t>An explicit user action evaluates selected events using their active source policy, then correlates only the admitted/escalated survivors. Each existing service retains its own durable transaction; failed evaluations remain visible and retryable. No automatic collector or infrastructure action follows. Saved correlation analyses come from the existing owner-scoped decision journal, survive reload, and show groups, input events, paths, graph revision, time and limitations. Degraded exact-asset fallback is labeled as such, never as proven dependency correlation.</w:t>
-      </w:r>
-    </w:p>
-    <w:p>
-      <w:pPr/>
-      <w:r>
-        <w:t>The graph and flow reuse existing source, policy, SQL, OpenSearch, original-caller and native engine contracts. They introduce no separate database, ingestion runtime or credential store. Continuous processing, separate OTLP observations, anomaly detection, conditional evidence consumers, execution and external synchronization remain open.</w:t>
-      </w:r>
-    </w:p>
-    <w:p>
-      <w:pPr/>
-      <w:r>
-        <w:t>Native acceptance also exercises shared framework dependencies: cockpit tool URLs must place query parameters before application fragments, and SQL mutations must load foreign-key dependencies of earlier transaction reads before validating the whole snapshot. Neither fix weakens caller admission or referential integrity. The pinned local OpenSearch image is verified by content ID before Kind import aliases are repaired on each node.</w:t>
+        <w:t>ADR 0012: Application-defined cockpit navigation</w:t>
+      </w:r>
+    </w:p>
+    <w:p>
+      <w:pPr/>
+      <w:r>
+        <w:t>Status: Implemented; installed acceptance recorded in IMPLEMENTATION-STATUS.md.</w:t>
+      </w:r>
+    </w:p>
+    <w:p>
+      <w:pPr/>
+      <w:r>
+        <w:t>The Operations ticket link opened the global cockpit without `app=intelligent-operations`. The global framework profile also returned every static application tile without checking whether its provider was installed, active and admitted to the current person.</w:t>
+      </w:r>
+    </w:p>
+    <w:p>
+      <w:pPr/>
+      <w:r>
+        <w:t>Use the existing application manifest contract. Operations `ui.static` declares its Overview, Topology, Data pipeline, Sources and Workflow Studio destinations; `ribbon.hideFrameworkItems` retains the canonical Tickets view and excludes unrelated framework workbenches. Ticket links preserve `/cockpit/?app=intelligent-operations&amp;ticket=…`. The shell resolves the declared default tool name to its registered view identifier. Workflow Studio appears only when its owning application is active and admitted.</w:t>
+      </w:r>
+    </w:p>
+    <w:p>
+      <w:pPr/>
+      <w:r>
+        <w:t>Global toolbar links use the same current route-owner admission as application tiles. An administrator does not get links to unloaded applications merely by being an administrator. Native Files, Security Center, Test Lab and Eval Wall remain kernel pages with their existing reader/operator checks. The Apps menu continues to use current admitted workspace discovery. Hidden navigation never substitutes for route authorization, which is checked again on use.</w:t>
+      </w:r>
+    </w:p>
+    <w:p>
+      <w:pPr/>
+      <w:r>
+        <w:t>This changes navigation and context retention; it does not implement missing telemetry, anomaly detection, generated remediation or automated infrastructure execution.</w:t>
       </w:r>
     </w:p>
     <w:p>
@@ -1742,49 +1724,49 @@
         <w:pStyle w:val="Title"/>
       </w:pPr>
       <w:r>
-        <w:t>ADR 0014: Native scheduled processing of admitted alerts</w:t>
-      </w:r>
-    </w:p>
-    <w:p>
-      <w:pPr/>
-      <w:r>
-        <w:t>Status: Implemented; native scheduled processing and pause/resume verified in the local Kubernetes installation.</w:t>
-      </w:r>
-    </w:p>
-    <w:p>
-      <w:pPr/>
-      <w:r>
-        <w:t>Recorded alerts must continue through published rules without an operator repeatedly pressing Evaluate. Use the existing OSHAL personal scheduler and declared service route. The activating person remains the caller; each run rechecks current package authority. There is no application daemon, borrowed administrator credential or cluster access.</w:t>
-      </w:r>
-    </w:p>
-    <w:p>
-      <w:pPr/>
-      <w:r>
-        <w:t>Processing is disabled initially. The operator selects exact saved source revisions, each with a published policy, saves the configuration and activates the native schedule. Configuration uses revision checks. Pausing the native schedule stops future ticks; disabling processing also fences already claimed work before a decision commits.</w:t>
-      </w:r>
-    </w:p>
-    <w:p>
-      <w:pPr/>
-      <w:r>
-        <w:t>The existing transactional queue owns eligibility, attempt count and a 120-second lease. Each bounded run claims one item at a time, processes at most ten, and stops starting items after 45 seconds. A native 120-second invocation budget accommodates the final engine request. Claims, decisions and lease checks retain caller isolation. Concurrent workers cannot count an occurrence twice. An expired claim can be recovered; a stale worker cannot commit a decision. Transient failures receive exponential backoff (up to one hour), permanent or exhausted failures require an explicit retry. A lost commit acknowledgement cannot turn completed work back into pending work.</w:t>
-      </w:r>
-    </w:p>
-    <w:p>
-      <w:pPr/>
-      <w:r>
-        <w:t>The experience displays saved processing configuration separately from native schedule activation and recent job states. Missing scheduler access is unavailable, never active. Revoked access clears private records. Native run failures remain failures even if an earlier item in that batch succeeded. Lease tokens are not exposed to the experience.</w:t>
-      </w:r>
-    </w:p>
-    <w:p>
-      <w:pPr/>
-      <w:r>
-        <w:t>This increment consumes already admitted alerts and reserves downstream evidence work. It does not authenticate an external producer, ingest OTLP, correlate on a timer, collect evidence, generate remediation, authorize execution or synchronize tickets. Those remain separate delivery gates in the full Event-to-Action plan.</w:t>
-      </w:r>
-    </w:p>
-    <w:p>
-      <w:pPr/>
-      <w:r>
-        <w:t>Acceptance: eight real SQL/OpenSearch/browser contracts cover concurrent workers, expired claims, stopping processing, retry exhaustion and explicit recovery, lost commit acknowledgements, owner isolation and unavailable scheduler UI. The complete Operations suite passes 60 cases with no skips. The installed native scheduler processed seven labeled acceptance alerts without a manual processing call or trigger. A 65-second pause retained new work; reactivation processed it. Both native receipts report scheduled execution and HTTP 200. Acceptance leaves the worker disabled and its schedule inactive. The configuration row is locked through the decision commit so disabling cannot acknowledge ahead of that commit.</w:t>
+        <w:t>ADR 0013: Inspectable graph and processing cohorts</w:t>
+      </w:r>
+    </w:p>
+    <w:p>
+      <w:pPr/>
+      <w:r>
+        <w:t>Status: Implemented and verified in the local Kubernetes experience; receipt in `deploy/evidence/detection.json`.</w:t>
+      </w:r>
+    </w:p>
+    <w:p>
+      <w:pPr/>
+      <w:r>
+        <w:t>The experience must explain what survived filtering, deduplication and correlation. Counters without shared provenance or raw JSON alone do not provide that explanation.</w:t>
+      </w:r>
+    </w:p>
+    <w:p>
+      <w:pPr/>
+      <w:r>
+        <w:t>The Graph explorer loads the caller's reconstructed inventory and presents searchable, typed, keyboard-accessible nodes. Selecting a node opens its directed relationships, health observation, native identity, scope and source evidence. The overview renders at most 100 matching nodes and states the truncation; source reconstruction budgets remain unchanged. Missing nodes are not inferred to be deleted after partial collection.</w:t>
+      </w:r>
+    </w:p>
+    <w:p>
+      <w:pPr/>
+      <w:r>
+        <w:t>The processing flow uses one latest returned decision per delivery. Its incoming cohort, percolator matches and new/escalated symptoms share that denominator. It displays both fractions and counts, with event drill-downs and separate unmatched/suppressed states. These are latest returned pages, not installation totals or a live throughput claim. Policy replay does not increase a delivery count. Correlation coverage is shown separately because analyses can overlap and cannot safely be added together.</w:t>
+      </w:r>
+    </w:p>
+    <w:p>
+      <w:pPr/>
+      <w:r>
+        <w:t>An explicit user action evaluates selected events using their active source policy, then correlates only the admitted/escalated survivors. Each existing service retains its own durable transaction; failed evaluations remain visible and retryable. No automatic collector or infrastructure action follows. Saved correlation analyses come from the existing owner-scoped decision journal, survive reload, and show groups, input events, paths, graph revision, time and limitations. Degraded exact-asset fallback is labeled as such, never as proven dependency correlation.</w:t>
+      </w:r>
+    </w:p>
+    <w:p>
+      <w:pPr/>
+      <w:r>
+        <w:t>The graph and flow reuse existing source, policy, SQL, OpenSearch, original-caller and native engine contracts. They introduce no separate database, ingestion runtime or credential store. Continuous processing, separate OTLP observations, anomaly detection, conditional evidence consumers, execution and external synchronization remain open.</w:t>
+      </w:r>
+    </w:p>
+    <w:p>
+      <w:pPr/>
+      <w:r>
+        <w:t>Native acceptance also exercises shared framework dependencies: cockpit tool URLs must place query parameters before application fragments, and SQL mutations must load foreign-key dependencies of earlier transaction reads before validating the whole snapshot. Neither fix weakens caller admission or referential integrity. The pinned local OpenSearch image is verified by content ID before Kind import aliases are repaired on each node.</w:t>
       </w:r>
     </w:p>
     <w:p>
@@ -1792,6 +1774,56 @@
         <w:pStyle w:val="Title"/>
       </w:pPr>
       <w:r>
+        <w:t>ADR 0014: Native scheduled processing of admitted alerts</w:t>
+      </w:r>
+    </w:p>
+    <w:p>
+      <w:pPr/>
+      <w:r>
+        <w:t>Status: Implemented; native scheduled processing and pause/resume verified in the local Kubernetes installation.</w:t>
+      </w:r>
+    </w:p>
+    <w:p>
+      <w:pPr/>
+      <w:r>
+        <w:t>Recorded alerts must continue through published rules without an operator repeatedly pressing Evaluate. Use the existing OSHAL personal scheduler and declared service route. The activating person remains the caller; each run rechecks current package authority. There is no application daemon, borrowed administrator credential or cluster access.</w:t>
+      </w:r>
+    </w:p>
+    <w:p>
+      <w:pPr/>
+      <w:r>
+        <w:t>Processing is disabled initially. The operator selects exact saved source revisions, each with a published policy, saves the configuration and activates the native schedule. Configuration uses revision checks. Pausing the native schedule stops future ticks; disabling processing also fences already claimed work before a decision commits.</w:t>
+      </w:r>
+    </w:p>
+    <w:p>
+      <w:pPr/>
+      <w:r>
+        <w:t>The existing transactional queue owns eligibility, attempt count and a 120-second lease. Each bounded run claims one item at a time, processes at most ten, and stops starting items after 45 seconds. A native 120-second invocation budget accommodates the final engine request. Claims, decisions and lease checks retain caller isolation. Concurrent workers cannot count an occurrence twice. An expired claim can be recovered; a stale worker cannot commit a decision. Transient failures receive exponential backoff (up to one hour), permanent or exhausted failures require an explicit retry. A lost commit acknowledgement cannot turn completed work back into pending work.</w:t>
+      </w:r>
+    </w:p>
+    <w:p>
+      <w:pPr/>
+      <w:r>
+        <w:t>The experience displays saved processing configuration separately from native schedule activation and recent job states. Missing scheduler access is unavailable, never active. Revoked access clears private records. Native run failures remain failures even if an earlier item in that batch succeeded. Lease tokens are not exposed to the experience.</w:t>
+      </w:r>
+    </w:p>
+    <w:p>
+      <w:pPr/>
+      <w:r>
+        <w:t>This increment consumes already admitted alerts and reserves downstream evidence work. It does not authenticate an external producer, ingest OTLP, correlate on a timer, collect evidence, generate remediation, authorize execution or synchronize tickets. Those remain separate delivery gates in the full Event-to-Action plan.</w:t>
+      </w:r>
+    </w:p>
+    <w:p>
+      <w:pPr/>
+      <w:r>
+        <w:t>Acceptance: eight real SQL/OpenSearch/browser contracts cover concurrent workers, expired claims, stopping processing, retry exhaustion and explicit recovery, lost commit acknowledgements, owner isolation and unavailable scheduler UI. The complete Operations suite passes 60 cases with no skips. The installed native scheduler processed seven labeled acceptance alerts without a manual processing call or trigger. A 65-second pause retained new work; reactivation processed it. Both native receipts report scheduled execution and HTTP 200. Acceptance leaves the worker disabled and its schedule inactive. The configuration row is locked through the decision commit so disabling cannot acknowledge ahead of that commit.</w:t>
+      </w:r>
+    </w:p>
+    <w:p>
+      <w:pPr>
+        <w:pStyle w:val="Title"/>
+      </w:pPr>
+      <w:r>
         <w:t>ADR 0015: The workspace editor belongs to the kernel baseline</w:t>
       </w:r>
     </w:p>
@@ -2909,6 +2941,252 @@
       <w:pPr/>
       <w:r>
         <w:t>Native cockpit inspection at 1280px exposed inherited setup-form label margins and an early filter wrap that displaced the resource workbench. The filters now use compact margins and a single desktop row at embedded widths of at least 960px, with wrapping below that width. Filtered tree groups use the validated system catalogue for their labels, preserving the observed cluster name without adding excluded assets. Tests exercise the 1040px embedded width and filtered-pod label alongside existing phone, keyboard and access cases.</w:t>
+      </w:r>
+    </w:p>
+    <w:p>
+      <w:pPr>
+        <w:pStyle w:val="Title"/>
+      </w:pPr>
+      <w:r>
+        <w:t>ADR0037: Approved response, isolated execution and verified recovery</w:t>
+      </w:r>
+    </w:p>
+    <w:p>
+      <w:pPr/>
+      <w:r>
+        <w:t>Status: implemented in source, 22 October 2026; SQL and shipped-browser guards pass; installed acceptance on the owned lab is recorded separately in IMPLEMENTATION-STATUS.md. Extends ADR0011, ADR0023, ADR0025, ADR0031 and ADR0034.</w:t>
+      </w:r>
+    </w:p>
+    <w:p>
+      <w:pPr/>
+      <w:r>
+        <w:t>The response stage closes the gap between an accepted report and a measured recovery without adding cluster authority to any bot or package service.</w:t>
+      </w:r>
+    </w:p>
+    <w:p>
+      <w:pPr/>
+      <w:r>
+        <w:t>**Generated files are extracted byte-exact, never invented.** The workflow's accepted answer (the revise phase's actual `answer.md` work artifact) names its response files as fenced blocks whose info string is `file=NAME`: `remediate.sh`, `verify.sh`, `rollback.md`, `verify.md` (optional `diagnose.sh`). The package stores those bytes with SHA-256 digests, byte ranges, the producing ticket, work record, phase and answer digest. The answer bytes reach the package through the operator's browser from the canonical work read, so the record is labeled `answerProvenance: operator-forwarded-canonical-work`; the kernel has no package port for work reads or artifact registration. Prose is not parsed into files; a missing file, a duplicate, an oversize script or a `remediate.sh` without a preceding "approval required" statement makes the answer non-executable, and the UI says so.</w:t>
+      </w:r>
+    </w:p>
+    <w:p>
+      <w:pPr/>
+      <w:r>
+        <w:t>**A plan binds one observed target.** The target pod is accepted only when the caller's own recorded inventory (the temporal graph) has observed its UID and name; namespace and container are explicit. The plan identity is the digest of ticket, canonical revision, work record, answer digest, artifacts and target. The exec input is fixed at plan time: `/bin/sh -eu -c &lt;remediate.sh&gt;` inside that container, which keeps the executor within the namespace-scoped pod exec RBAC the standard pod-connect installer grants.</w:t>
+      </w:r>
+    </w:p>
+    <w:p>
+      <w:pPr/>
+      <w:r>
+        <w:t>**Approval binds principal, digests, target, revision and expiry.** An approval is recorded by the signed-in person against the plan's artifact digests, target and canonical ticket revision and expires after thirty minutes. A changed revision or digest refuses approval and dispatch before anything runs. Report acceptance remains a separate canonical gate (ADR0011).</w:t>
+      </w:r>
+    </w:p>
+    <w:p>
+      <w:pPr/>
+      <w:r>
+        <w:t>**One dispatch per approval, reserved before the native action.** Reservation precedes the browser's fresh native confirmation and `kubernetes-exec` through the person's own Kubernetes connection (ADR0034). Twelve concurrent callers reserve once; a lost commit acknowledgement leaves the reservation in place and refuses a second dispatch. The pre-dispatch identity readback must return the same pod UID. The action result the browser reports is stored as an operator report (`verifiedByServer: false`); it never changes canonical status or counts as recovery.</w:t>
+      </w:r>
+    </w:p>
+    <w:p>
+      <w:pPr/>
+      <w:r>
+        <w:t>**Recovery is measured, with four outcomes (ADR0031).** A verification is a reserved read-only exec of `verify.sh` plus a current pod readback. `regressed` when the check fails, `inconclusive` when its outcome is unknown, the identity differs or no resolved signal exists yet, `timed-out` after fifteen minutes without one, and `healthy` only when the check passes, the identity matches and a validated `resolved` delivery for the same resource (and alert type, when the plan is linked to an investigation) was admitted after the action. The signal half is read by the server from the caller's own deliveries. Up to ten verifications per execution.</w:t>
+      </w:r>
+    </w:p>
+    <w:p>
+      <w:pPr/>
+      <w:r>
+        <w:t>**The ticket update is server-read.** After a healthy outcome the browser approves the canonical report gate with a fresh confirmation; the package then re-reads the ticket through its ticket port and records status and revision as `verifiedByServer: true`. External issue handoff stays the manual snapshot flow of ADR0025.</w:t>
+      </w:r>
+    </w:p>
+    <w:p>
+      <w:pPr/>
+      <w:r>
+        <w:t>**Downloads.** Every artifact and the execution receipt are authenticated own-scope downloads with `Content-Disposition: attachment` and the digest in a response header. They are package records, not kernel ticket-workspace artifacts: the kernel materializes only worker results.</w:t>
+      </w:r>
+    </w:p>
+    <w:p>
+      <w:pPr/>
+      <w:r>
+        <w:t>Alternatives rejected: parsing prose or supplied lab proposals into files; a package-held cluster credential or kubectl executor; approval without expiry or digest binding; counting command exit as recovery; automatic re-dispatch after an unknown outcome; changing canonical status from a client report.</w:t>
+      </w:r>
+    </w:p>
+    <w:p>
+      <w:pPr/>
+      <w:r>
+        <w:t>Proof: `tests/execution.test.cjs` (real PostgreSQL forced-owner isolation, concurrent and lost-acknowledgement reservations, expiry and revision invalidation, outcome rules with firing versus resolved deliveries, server-read ticket update, and the shipped panel against explicit native confirmation/exec/approve fixtures).</w:t>
+      </w:r>
+    </w:p>
+    <w:p>
+      <w:pPr>
+        <w:pStyle w:val="Title"/>
+      </w:pPr>
+      <w:r>
+        <w:t>ADR0038: Local anomaly service, automatic correlation and tick notifications</w:t>
+      </w:r>
+    </w:p>
+    <w:p>
+      <w:pPr/>
+      <w:r>
+        <w:t>Status: implemented in source, 22 October 2026; SQL and detector guards pass; NAB pilot receipt recorded in `deploy/evidence/anomaly-nab.json`. Extends ADR0007, ADR0014, ADR0018 and ADR0020.</w:t>
+      </w:r>
+    </w:p>
+    <w:p>
+      <w:pPr/>
+      <w:r>
+        <w:t>**A real detector, local and explicit.** Two deterministic statistical detectors ship in the package (`ui/anomaly-detector.js`, shared by the server tick and the offline evaluation): a rolling robust z-score (median and MAD over the last N samples) and a seasonal time-of-day profile (per-bucket median and MAD). Each new metric sample is scored against the baseline learned from earlier samples only, then learned from unless it was anomalous. Readiness is explicit per resource and metric: cold (warm-up), ready, stale (gap larger than the configured cadence budget, which restarts the rolling baseline), late (older than the cursor, counted and skipped), invalid, failed. No imported or rescored external result is counted as detection.</w:t>
+      </w:r>
+    </w:p>
+    <w:p>
+      <w:pPr/>
+      <w:r>
+        <w:t>**Candidates are source alerts.** A candidate is admitted through the normal intake under a dedicated alert source revision the operator chooses: `alertType = anomaly:&lt;detector&gt;:&lt;metric&gt;`, status firing or resolved, severity by score, and the raw payload carries detector id/version, window, baseline, score, confidence, readiness and the telemetry observation id. Candidates then pass the same percolation rules and symptom reduction as any source alert, so a published policy for the candidate source decides what becomes work.</w:t>
+      </w:r>
+    </w:p>
+    <w:p>
+      <w:pPr/>
+      <w:r>
+        <w:t>**Durable, idempotent processing.** Detector state lives in `operations_anomaly_state`: the configuration (compare-and-set), one compound cursor per telemetry source `(observed_at, id)` locked for update per pass, and bounded baselines (at most 500 per person, at most 2000 samples per rolling window, 64 per seasonal bucket). A pass reads at most 500 samples per source in cursor order, admits candidates (idempotent by candidate id), and advances the cursor only after every admit of the batch succeeded; a failure keeps the cursor, records the error on it, and the next tick retries. Two concurrent replicas cannot both admit the same candidate.</w:t>
+      </w:r>
+    </w:p>
+    <w:p>
+      <w:pPr/>
+      <w:r>
+        <w:t>**Automatic post-reduction correlation.** When the processing worker opts in, each scheduled tick that admitted or escalated a symptom correlates the admitted firing cohort of the policy window over the recorded temporal graph with a bounded versioned dependency policy. The cohort's newest alert time keys the record, so an unchanged cohort is idempotent; events without a recorded asset stay explicitly unresolved; nothing is dispatched.</w:t>
+      </w:r>
+    </w:p>
+    <w:p>
+      <w:pPr/>
+      <w:r>
+        <w:t>**Tick notifications.** After each tick the package asks the kernel notification rail (`uses: notify.send`) to tell the signed-in person about admitted symptoms, candidates and failures. The rail chooses the channel from the person's preferences and may skip silently, so the tick reports a request, never delivery.</w:t>
+      </w:r>
+    </w:p>
+    <w:p>
+      <w:pPr/>
+      <w:r>
+        <w:t>**Measured, not tuned.** `lab/nab_evaluate.cjs` evaluates both detectors on the pinned NAB pilot: a-priori parameters on whole series, and parameters calibrated on the first 30% of each series with labels unread, evaluated on the remainder after a one-lookback gap. The receipt reports detected and missed windows, first-detection lead time, alerts outside windows per observed day, warm-up and runtime, and says it is not an official NAB score. The a-priori run detects every labelled window with zero false alerts on both controls for the seasonal profile, but about twenty alerts a day on the noisy CPU series; the calibrated run brings that to below one a day at the cost of the EC2 latency windows and a much longer lead time. Both are recorded; neither is hidden.</w:t>
+      </w:r>
+    </w:p>
+    <w:p>
+      <w:pPr/>
+      <w:r>
+        <w:t>Alternatives rejected: threshold rules presented as anomaly detection; importing archived detector results; a cursor by timestamp only; learning from anomalous samples; silently advancing past a failed admit; counting a notification request as delivery.</w:t>
+      </w:r>
+    </w:p>
+    <w:p>
+      <w:pPr>
+        <w:pStyle w:val="Title"/>
+      </w:pPr>
+      <w:r>
+        <w:t>ADR0039: Node-level Kubernetes explorer and coached commands under the operator's own authority</w:t>
+      </w:r>
+    </w:p>
+    <w:p>
+      <w:pPr/>
+      <w:r>
+        <w:t>Status: implemented in source, 22 October 2026; guards pass. Extends ADR0019, ADR0032 and ADR0034.</w:t>
+      </w:r>
+    </w:p>
+    <w:p>
+      <w:pPr/>
+      <w:r>
+        <w:t>**Nodes are first-class in Systems.** The scan normalizer records each node's capacity and allocatable (CPU, memory, pods), its conditions with any pressure flagged, cordon state, roles, taints, internal IP and hostname, kubelet, OS, container runtime, architecture and kernel, as bounded scalar facts. The detail pane shows a capacity table, the pressure and cordon warnings, the version facts and the pods placed on the node from recorded placement edges; each pod is a link that expands the tree to the exact pod. Absent facts are omitted, never fabricated, and the pane says the facts are saved observations, not a live read.</w:t>
+      </w:r>
+    </w:p>
+    <w:p>
+      <w:pPr/>
+      <w:r>
+        <w:t>**Coached commands run under the person's own authorization.** The Command helper page asks the operations analyst for one reviewable command from a `cli-helper-v1` packet: tool, goal, optional context (treated as data) and the recorded target. The reply is an argv array with reason, read-only flag, risk and verification; prose without a valid argv stages nothing, and a proposal that looks like it contains a credential is discarded. Two execution paths exist, and the page says which applies:</w:t>
+      </w:r>
+    </w:p>
+    <w:p>
+      <w:pPr>
+        <w:pStyle w:val="ListBullet"/>
+      </w:pPr>
+      <w:r>
+        <w:t>`pod-exec`: the reviewed command runs once through the person's own Kubernetes connection with</w:t>
+      </w:r>
+    </w:p>
+    <w:p>
+      <w:pPr/>
+      <w:r>
+        <w:t>a fresh native confirmation (ADR0034), and the native result is recorded.</w:t>
+      </w:r>
+    </w:p>
+    <w:p>
+      <w:pPr>
+        <w:pStyle w:val="ListBullet"/>
+      </w:pPr>
+      <w:r>
+        <w:t>`kubectl`, `aws`, `gcloud`, `az`: the person copies the command and runs it in their own</w:t>
+      </w:r>
+    </w:p>
+    <w:p>
+      <w:pPr/>
+      <w:r>
+        <w:t>terminal or OSHAL Node under their signed-in profile, then records the pasted result. The record is labelled operator-provided; the application executed nothing and holds no cloud credential.</w:t>
+      </w:r>
+    </w:p>
+    <w:p>
+      <w:pPr/>
+      <w:r>
+        <w:t>Records are closed, bounded (16 KiB output, 200 per person) and own-scope.</w:t>
+      </w:r>
+    </w:p>
+    <w:p>
+      <w:pPr/>
+      <w:r>
+        <w:t>**What the kernel would need for in-application cloud execution.** There is no rail today for a page or package to run `aws`, `gcloud`, `az` or `kubectl` under the person's credentials: the cloud connector catalog has no executable AWS signing (SigV4), no Azure management connector, no SSH or host-shell connector, and the native node cannot receive shell tasks. Those are listed in [KERNEL-RAILS-NEEDED.md](../KERNEL-RAILS-NEEDED.md); this application will adopt a rail the day it exists without changing its review-first flow.</w:t>
+      </w:r>
+    </w:p>
+    <w:p>
+      <w:pPr/>
+      <w:r>
+        <w:t>Alternatives rejected: a package-held kubeconfig or cloud profile; running commands through the analysis bot; presenting pasted output as verified; hiding nodes behind pod placement only.</w:t>
+      </w:r>
+    </w:p>
+    <w:p>
+      <w:pPr>
+        <w:pStyle w:val="Title"/>
+      </w:pPr>
+      <w:r>
+        <w:t>ADR0040: Git promotion and break-glass reconciliation</w:t>
+      </w:r>
+    </w:p>
+    <w:p>
+      <w:pPr/>
+      <w:r>
+        <w:t>Status: implemented in source, 22 October 2026. Package guards pass; the kernel catalog operations are on `dev/native-parity` as 0f86a3c with their own guard. Live acceptance needs an installation that ships that catalog, the GitHub or GitLab service selected by an operator and the person's own connected account. Extends ADR0025, ADR0031 and ADR0037.</w:t>
+      </w:r>
+    </w:p>
+    <w:p>
+      <w:pPr/>
+      <w:r>
+        <w:t>Roger asked for two levels of change: an upper level where changes go to Git and a pipeline applies them, and a lower level where an emergency patch is pushed directly (break-glass). Both now start from the same response plan (ADR0037), so the bytes that are reviewed, executed and committed are identical.</w:t>
+      </w:r>
+    </w:p>
+    <w:p>
+      <w:pPr/>
+      <w:r>
+        <w:t>**Standard path (upper level).** From a plan, "Commit, open request" reserves one promotion per plan and destination, then the browser, under the person's own GitHub or GitLab connection with a fresh confirmation per write, reads the base branch, commits the plan's exact generated files plus a manifest (plan, ticket and revision, work record, answer digest, target, artifact digests) to a new branch `triagenorth-&lt;plan&gt;`, opens a pull or merge request whose body states that nothing was executed on the cluster, and optionally starts the pipeline on that branch (GitHub workflow dispatch or a GitLab pipeline). Merge and pipeline status are read back on request.</w:t>
+      </w:r>
+    </w:p>
+    <w:p>
+      <w:pPr/>
+      <w:r>
+        <w:t>**Break-glass path (lower level).** The emergency change itself is the existing approved exec (ADR0037). After it has a reported outcome, "Reconcile break-glass change in Git" commits the same files with the execution receipt to `triagenorth-reconcile-&lt;plan&gt;` and opens a request that must be merged, or reverted in Git, within 24 hours of the execution; the deadline is recorded and an unmerged reconciliation past it is shown overdue. A reconciliation cannot be reserved before an execution exists.</w:t>
+      </w:r>
+    </w:p>
+    <w:p>
+      <w:pPr/>
+      <w:r>
+        <w:t>**Authority and evidence.** The server holds the file bytes and builds the manifest, commit message and request text; the browser only relays them through the kernel's connector actions, which fix the provider origin, admit exact variables and require confirmation for every write (kernel 0f86a3c). One reservation per plan, path and destination is written before the first provider write; a retry is refused rather than creating a second branch, and a failure mid-way is held as uncertain. Provider results (commit, request number and link, pipeline status, merged) are the operator session's report (`verifiedByServer: false`); links are accepted only on github.com or gitlab.com.</w:t>
+      </w:r>
+    </w:p>
+    <w:p>
+      <w:pPr/>
+      <w:r>
+        <w:t>**Swarm-to-swarm.** When a lower swarm owns the monitored environment, the same manifest and files are the natural delegation payload; routing them over Jarvis between installations needs the kernel A2A rail listed in KERNEL-RAILS-NEEDED.md and is not claimed here.</w:t>
       </w:r>
     </w:p>
     <w:sectPr>

</xml_diff>